<commit_message>
complete 5 db laboratory
</commit_message>
<xml_diff>
--- a/BD/Laboratory_04/Отчет_ЛР4.docx
+++ b/BD/Laboratory_04/Отчет_ЛР4.docx
@@ -567,7 +567,6 @@
         </w:rPr>
         <w:t xml:space="preserve">Преподаватель: </w:t>
       </w:r>
-      <w:proofErr w:type="spellStart"/>
       <w:r>
         <w:rPr>
           <w:rFonts w:cs="Times New Roman"/>
@@ -576,7 +575,6 @@
         </w:rPr>
         <w:t>Нистюк</w:t>
       </w:r>
-      <w:proofErr w:type="spellEnd"/>
       <w:r>
         <w:rPr>
           <w:rFonts w:cs="Times New Roman"/>
@@ -4063,147 +4061,7 @@
           <w:szCs w:val="28"/>
           <w:lang w:val="ru-RU" w:eastAsia="ru-RU"/>
         </w:rPr>
-        <w:t>: – исследовать логические (табличные пространства, сегменты, экстенты) и физические (файлы данных) структуры базы данных; – изучить механизм работы системной корзины (</w:t>
-      </w:r>
-      <w:proofErr w:type="spellStart"/>
-      <w:r>
-        <w:rPr>
-          <w:rFonts w:cs="Times New Roman"/>
-          <w:color w:val="auto"/>
-          <w:szCs w:val="28"/>
-          <w:lang w:val="ru-RU" w:eastAsia="ru-RU"/>
-        </w:rPr>
-        <w:t>Recycle</w:t>
-      </w:r>
-      <w:proofErr w:type="spellEnd"/>
-      <w:r>
-        <w:rPr>
-          <w:rFonts w:cs="Times New Roman"/>
-          <w:color w:val="auto"/>
-          <w:szCs w:val="28"/>
-          <w:lang w:val="ru-RU" w:eastAsia="ru-RU"/>
-        </w:rPr>
-        <w:t xml:space="preserve"> </w:t>
-      </w:r>
-      <w:proofErr w:type="spellStart"/>
-      <w:r>
-        <w:rPr>
-          <w:rFonts w:cs="Times New Roman"/>
-          <w:color w:val="auto"/>
-          <w:szCs w:val="28"/>
-          <w:lang w:val="ru-RU" w:eastAsia="ru-RU"/>
-        </w:rPr>
-        <w:t>Bin</w:t>
-      </w:r>
-      <w:proofErr w:type="spellEnd"/>
-      <w:r>
-        <w:rPr>
-          <w:rFonts w:cs="Times New Roman"/>
-          <w:color w:val="auto"/>
-          <w:szCs w:val="28"/>
-          <w:lang w:val="ru-RU" w:eastAsia="ru-RU"/>
-        </w:rPr>
-        <w:t xml:space="preserve">) и восстановления объектов с помощью технологии </w:t>
-      </w:r>
-      <w:proofErr w:type="spellStart"/>
-      <w:r>
-        <w:rPr>
-          <w:rFonts w:cs="Times New Roman"/>
-          <w:color w:val="auto"/>
-          <w:szCs w:val="28"/>
-          <w:lang w:val="ru-RU" w:eastAsia="ru-RU"/>
-        </w:rPr>
-        <w:t>Flashback</w:t>
-      </w:r>
-      <w:proofErr w:type="spellEnd"/>
-      <w:r>
-        <w:rPr>
-          <w:rFonts w:cs="Times New Roman"/>
-          <w:color w:val="auto"/>
-          <w:szCs w:val="28"/>
-          <w:lang w:val="ru-RU" w:eastAsia="ru-RU"/>
-        </w:rPr>
-        <w:t>; – выполнить операции по управлению группами журналов повтора (</w:t>
-      </w:r>
-      <w:proofErr w:type="spellStart"/>
-      <w:r>
-        <w:rPr>
-          <w:rFonts w:cs="Times New Roman"/>
-          <w:color w:val="auto"/>
-          <w:szCs w:val="28"/>
-          <w:lang w:val="ru-RU" w:eastAsia="ru-RU"/>
-        </w:rPr>
-        <w:t>Redo</w:t>
-      </w:r>
-      <w:proofErr w:type="spellEnd"/>
-      <w:r>
-        <w:rPr>
-          <w:rFonts w:cs="Times New Roman"/>
-          <w:color w:val="auto"/>
-          <w:szCs w:val="28"/>
-          <w:lang w:val="ru-RU" w:eastAsia="ru-RU"/>
-        </w:rPr>
-        <w:t xml:space="preserve"> </w:t>
-      </w:r>
-      <w:proofErr w:type="spellStart"/>
-      <w:r>
-        <w:rPr>
-          <w:rFonts w:cs="Times New Roman"/>
-          <w:color w:val="auto"/>
-          <w:szCs w:val="28"/>
-          <w:lang w:val="ru-RU" w:eastAsia="ru-RU"/>
-        </w:rPr>
-        <w:t>Logs</w:t>
-      </w:r>
-      <w:proofErr w:type="spellEnd"/>
-      <w:r>
-        <w:rPr>
-          <w:rFonts w:cs="Times New Roman"/>
-          <w:color w:val="auto"/>
-          <w:szCs w:val="28"/>
-          <w:lang w:val="ru-RU" w:eastAsia="ru-RU"/>
-        </w:rPr>
-        <w:t>) и отработать перевод базы данных в режим архивирования (ARCHIVELOG) и обратно; – определить местоположение и исследовать содержимое конфигурационных файлов: управляющих файлов, файлов параметров (SPFILE/PFILE) и файла паролей; – изучить инфраструктуру диагностики (ADR) и найти записи о системных событиях в протоколе работы экземпляра (</w:t>
-      </w:r>
-      <w:proofErr w:type="spellStart"/>
-      <w:r>
-        <w:rPr>
-          <w:rFonts w:cs="Times New Roman"/>
-          <w:color w:val="auto"/>
-          <w:szCs w:val="28"/>
-          <w:lang w:val="ru-RU" w:eastAsia="ru-RU"/>
-        </w:rPr>
-        <w:t>Alert</w:t>
-      </w:r>
-      <w:proofErr w:type="spellEnd"/>
-      <w:r>
-        <w:rPr>
-          <w:rFonts w:cs="Times New Roman"/>
-          <w:color w:val="auto"/>
-          <w:szCs w:val="28"/>
-          <w:lang w:val="ru-RU" w:eastAsia="ru-RU"/>
-        </w:rPr>
-        <w:t xml:space="preserve"> </w:t>
-      </w:r>
-      <w:proofErr w:type="spellStart"/>
-      <w:r>
-        <w:rPr>
-          <w:rFonts w:cs="Times New Roman"/>
-          <w:color w:val="auto"/>
-          <w:szCs w:val="28"/>
-          <w:lang w:val="ru-RU" w:eastAsia="ru-RU"/>
-        </w:rPr>
-        <w:t>Log</w:t>
-      </w:r>
-      <w:proofErr w:type="spellEnd"/>
-      <w:r>
-        <w:rPr>
-          <w:rFonts w:cs="Times New Roman"/>
-          <w:color w:val="auto"/>
-          <w:szCs w:val="28"/>
-          <w:lang w:val="ru-RU" w:eastAsia="ru-RU"/>
-        </w:rPr>
-        <w:t>).</w:t>
+        <w:t>: – исследовать логические (табличные пространства, сегменты, экстенты) и физические (файлы данных) структуры базы данных; – изучить механизм работы системной корзины (Recycle Bin) и восстановления объектов с помощью технологии Flashback; – выполнить операции по управлению группами журналов повтора (Redo Logs) и отработать перевод базы данных в режим архивирования (ARCHIVELOG) и обратно; – определить местоположение и исследовать содержимое конфигурационных файлов: управляющих файлов, файлов параметров (SPFILE/PFILE) и файла паролей; – изучить инфраструктуру диагностики (ADR) и найти записи о системных событиях в протоколе работы экземпляра (Alert Log).</w:t>
       </w:r>
     </w:p>
     <w:p>
@@ -4262,14 +4120,12 @@
         </w:rPr>
         <w:t xml:space="preserve">Для выполнения задания использовался </w:t>
       </w:r>
-      <w:proofErr w:type="spellStart"/>
       <w:r>
         <w:rPr>
           <w:rFonts w:cs="Times New Roman"/>
         </w:rPr>
         <w:t>sql</w:t>
       </w:r>
-      <w:proofErr w:type="spellEnd"/>
       <w:r>
         <w:rPr>
           <w:rFonts w:cs="Times New Roman"/>
@@ -4309,27 +4165,7 @@
                 <w:szCs w:val="24"/>
                 <w:lang w:val="ru-RU"/>
               </w:rPr>
-              <w:t xml:space="preserve">-- Получить все файлы табличных </w:t>
-            </w:r>
-            <w:proofErr w:type="spellStart"/>
-            <w:r>
-              <w:rPr>
-                <w:rFonts w:cs="Times New Roman"/>
-                <w:sz w:val="24"/>
-                <w:szCs w:val="24"/>
-                <w:lang w:val="ru-RU"/>
-              </w:rPr>
-              <w:t>простарнст</w:t>
-            </w:r>
-            <w:proofErr w:type="spellEnd"/>
-            <w:r>
-              <w:rPr>
-                <w:rFonts w:cs="Times New Roman"/>
-                <w:sz w:val="24"/>
-                <w:szCs w:val="24"/>
-                <w:lang w:val="ru-RU"/>
-              </w:rPr>
-              <w:t xml:space="preserve"> --</w:t>
+              <w:t>-- Получить все файлы табличных простарнст --</w:t>
             </w:r>
           </w:p>
           <w:p>
@@ -4349,7 +4185,6 @@
               </w:rPr>
               <w:t xml:space="preserve">SELECT </w:t>
             </w:r>
-            <w:proofErr w:type="spellStart"/>
             <w:r>
               <w:rPr>
                 <w:rFonts w:ascii="Courier New" w:hAnsi="Courier New" w:cs="Courier New"/>
@@ -4364,70 +4199,7 @@
                 <w:sz w:val="24"/>
                 <w:szCs w:val="24"/>
               </w:rPr>
-              <w:t>_name</w:t>
-            </w:r>
-            <w:proofErr w:type="spellEnd"/>
-            <w:r>
-              <w:rPr>
-                <w:rFonts w:cs="Times New Roman"/>
-                <w:sz w:val="24"/>
-                <w:szCs w:val="24"/>
-              </w:rPr>
-              <w:t xml:space="preserve">, </w:t>
-            </w:r>
-            <w:proofErr w:type="spellStart"/>
-            <w:r>
-              <w:rPr>
-                <w:rFonts w:cs="Times New Roman"/>
-                <w:sz w:val="24"/>
-                <w:szCs w:val="24"/>
-              </w:rPr>
-              <w:t>file_name</w:t>
-            </w:r>
-            <w:proofErr w:type="spellEnd"/>
-            <w:r>
-              <w:rPr>
-                <w:rFonts w:cs="Times New Roman"/>
-                <w:sz w:val="24"/>
-                <w:szCs w:val="24"/>
-              </w:rPr>
-              <w:t xml:space="preserve">, bytes/1024/1024 AS </w:t>
-            </w:r>
-            <w:proofErr w:type="spellStart"/>
-            <w:r>
-              <w:rPr>
-                <w:rFonts w:cs="Times New Roman"/>
-                <w:sz w:val="24"/>
-                <w:szCs w:val="24"/>
-              </w:rPr>
-              <w:t>size_mb</w:t>
-            </w:r>
-            <w:proofErr w:type="spellEnd"/>
-            <w:r>
-              <w:rPr>
-                <w:rFonts w:cs="Times New Roman"/>
-                <w:sz w:val="24"/>
-                <w:szCs w:val="24"/>
-              </w:rPr>
-              <w:t xml:space="preserve">, 'DATAFILE' AS </w:t>
-            </w:r>
-            <w:proofErr w:type="spellStart"/>
-            <w:r>
-              <w:rPr>
-                <w:rFonts w:cs="Times New Roman"/>
-                <w:sz w:val="24"/>
-                <w:szCs w:val="24"/>
-              </w:rPr>
-              <w:t>file_type</w:t>
-            </w:r>
-            <w:proofErr w:type="spellEnd"/>
-            <w:r>
-              <w:rPr>
-                <w:rFonts w:cs="Times New Roman"/>
-                <w:sz w:val="24"/>
-                <w:szCs w:val="24"/>
-              </w:rPr>
-              <w:t xml:space="preserve"> </w:t>
+              <w:t xml:space="preserve">_name, file_name, bytes/1024/1024 AS size_mb, 'DATAFILE' AS file_type </w:t>
             </w:r>
           </w:p>
           <w:p>
@@ -4445,18 +4217,8 @@
                 <w:sz w:val="24"/>
                 <w:szCs w:val="24"/>
               </w:rPr>
-              <w:t xml:space="preserve">    FROM </w:t>
+              <w:t xml:space="preserve">    FROM dba_data_files</w:t>
             </w:r>
-            <w:proofErr w:type="spellStart"/>
-            <w:r>
-              <w:rPr>
-                <w:rFonts w:cs="Times New Roman"/>
-                <w:sz w:val="24"/>
-                <w:szCs w:val="24"/>
-              </w:rPr>
-              <w:t>dba_data_files</w:t>
-            </w:r>
-            <w:proofErr w:type="spellEnd"/>
           </w:p>
           <w:p>
             <w:pPr>
@@ -4491,79 +4253,7 @@
                 <w:sz w:val="24"/>
                 <w:szCs w:val="24"/>
               </w:rPr>
-              <w:t xml:space="preserve">    SELECT </w:t>
-            </w:r>
-            <w:proofErr w:type="spellStart"/>
-            <w:r>
-              <w:rPr>
-                <w:rFonts w:cs="Times New Roman"/>
-                <w:sz w:val="24"/>
-                <w:szCs w:val="24"/>
-              </w:rPr>
-              <w:t>tablespace_name</w:t>
-            </w:r>
-            <w:proofErr w:type="spellEnd"/>
-            <w:r>
-              <w:rPr>
-                <w:rFonts w:cs="Times New Roman"/>
-                <w:sz w:val="24"/>
-                <w:szCs w:val="24"/>
-              </w:rPr>
-              <w:t xml:space="preserve">, </w:t>
-            </w:r>
-            <w:proofErr w:type="spellStart"/>
-            <w:r>
-              <w:rPr>
-                <w:rFonts w:cs="Times New Roman"/>
-                <w:sz w:val="24"/>
-                <w:szCs w:val="24"/>
-              </w:rPr>
-              <w:t>file_name</w:t>
-            </w:r>
-            <w:proofErr w:type="spellEnd"/>
-            <w:r>
-              <w:rPr>
-                <w:rFonts w:cs="Times New Roman"/>
-                <w:sz w:val="24"/>
-                <w:szCs w:val="24"/>
-              </w:rPr>
-              <w:t xml:space="preserve">, bytes/1024/1024 AS </w:t>
-            </w:r>
-            <w:proofErr w:type="spellStart"/>
-            <w:r>
-              <w:rPr>
-                <w:rFonts w:cs="Times New Roman"/>
-                <w:sz w:val="24"/>
-                <w:szCs w:val="24"/>
-              </w:rPr>
-              <w:t>size_mb</w:t>
-            </w:r>
-            <w:proofErr w:type="spellEnd"/>
-            <w:r>
-              <w:rPr>
-                <w:rFonts w:cs="Times New Roman"/>
-                <w:sz w:val="24"/>
-                <w:szCs w:val="24"/>
-              </w:rPr>
-              <w:t xml:space="preserve">, 'TEMPFILE' AS </w:t>
-            </w:r>
-            <w:proofErr w:type="spellStart"/>
-            <w:r>
-              <w:rPr>
-                <w:rFonts w:cs="Times New Roman"/>
-                <w:sz w:val="24"/>
-                <w:szCs w:val="24"/>
-              </w:rPr>
-              <w:t>file_type</w:t>
-            </w:r>
-            <w:proofErr w:type="spellEnd"/>
-            <w:r>
-              <w:rPr>
-                <w:rFonts w:cs="Times New Roman"/>
-                <w:sz w:val="24"/>
-                <w:szCs w:val="24"/>
-              </w:rPr>
-              <w:t xml:space="preserve"> </w:t>
+              <w:t xml:space="preserve">    SELECT tablespace_name, file_name, bytes/1024/1024 AS size_mb, 'TEMPFILE' AS file_type </w:t>
             </w:r>
           </w:p>
           <w:p>
@@ -4588,27 +4278,7 @@
                 <w:szCs w:val="24"/>
                 <w:lang w:val="ru-RU"/>
               </w:rPr>
-              <w:t xml:space="preserve">FROM </w:t>
-            </w:r>
-            <w:proofErr w:type="spellStart"/>
-            <w:r>
-              <w:rPr>
-                <w:rFonts w:cs="Times New Roman"/>
-                <w:sz w:val="24"/>
-                <w:szCs w:val="24"/>
-                <w:lang w:val="ru-RU"/>
-              </w:rPr>
-              <w:t>dba_temp_files</w:t>
-            </w:r>
-            <w:proofErr w:type="spellEnd"/>
-            <w:r>
-              <w:rPr>
-                <w:rFonts w:cs="Times New Roman"/>
-                <w:sz w:val="24"/>
-                <w:szCs w:val="24"/>
-                <w:lang w:val="ru-RU"/>
-              </w:rPr>
-              <w:t>;</w:t>
+              <w:t>FROM dba_temp_files;</w:t>
             </w:r>
           </w:p>
         </w:tc>
@@ -4630,19 +4300,11 @@
         </w:rPr>
         <w:t xml:space="preserve">Приложение 1: Выполнение </w:t>
       </w:r>
-      <w:proofErr w:type="spellStart"/>
-      <w:r>
-        <w:rPr>
-          <w:rFonts w:cs="Times New Roman"/>
-        </w:rPr>
-        <w:t>sql</w:t>
-      </w:r>
-      <w:proofErr w:type="spellEnd"/>
-      <w:r>
-        <w:rPr>
-          <w:rFonts w:cs="Times New Roman"/>
-        </w:rPr>
-        <w:t>-</w:t>
+      <w:r>
+        <w:rPr>
+          <w:rFonts w:cs="Times New Roman"/>
+        </w:rPr>
+        <w:t>sql-</w:t>
       </w:r>
       <w:r>
         <w:rPr>
@@ -4667,14 +4329,12 @@
         </w:rPr>
         <w:t xml:space="preserve">Результат выполнения </w:t>
       </w:r>
-      <w:proofErr w:type="spellStart"/>
       <w:r>
         <w:rPr>
           <w:rFonts w:cs="Times New Roman"/>
         </w:rPr>
         <w:t>sql</w:t>
       </w:r>
-      <w:proofErr w:type="spellEnd"/>
       <w:r>
         <w:rPr>
           <w:rFonts w:cs="Times New Roman"/>
@@ -4757,14 +4417,12 @@
         </w:rPr>
         <w:t xml:space="preserve">Рисунок 1: Выполнение </w:t>
       </w:r>
-      <w:proofErr w:type="spellStart"/>
       <w:r>
         <w:rPr>
           <w:rFonts w:cs="Times New Roman"/>
         </w:rPr>
         <w:t>sql</w:t>
       </w:r>
-      <w:proofErr w:type="spellEnd"/>
       <w:r>
         <w:rPr>
           <w:rFonts w:cs="Times New Roman"/>
@@ -4800,61 +4458,11 @@
         </w:rPr>
         <w:t xml:space="preserve">На рисунке представлен полученный список табличных пространств базы данных и связанных с ними физических файлов. </w:t>
       </w:r>
-      <w:proofErr w:type="spellStart"/>
-      <w:r>
-        <w:rPr>
-          <w:rFonts w:cs="Times New Roman"/>
-        </w:rPr>
-        <w:t>Таблица</w:t>
-      </w:r>
-      <w:proofErr w:type="spellEnd"/>
-      <w:r>
-        <w:rPr>
-          <w:rFonts w:cs="Times New Roman"/>
-        </w:rPr>
-        <w:t xml:space="preserve"> </w:t>
-      </w:r>
-      <w:proofErr w:type="spellStart"/>
-      <w:r>
-        <w:rPr>
-          <w:rFonts w:cs="Times New Roman"/>
-        </w:rPr>
-        <w:t>содержит</w:t>
-      </w:r>
-      <w:proofErr w:type="spellEnd"/>
-      <w:r>
-        <w:rPr>
-          <w:rFonts w:cs="Times New Roman"/>
-        </w:rPr>
-        <w:t xml:space="preserve"> </w:t>
-      </w:r>
-      <w:proofErr w:type="spellStart"/>
-      <w:r>
-        <w:rPr>
-          <w:rFonts w:cs="Times New Roman"/>
-        </w:rPr>
-        <w:t>следующие</w:t>
-      </w:r>
-      <w:proofErr w:type="spellEnd"/>
-      <w:r>
-        <w:rPr>
-          <w:rFonts w:cs="Times New Roman"/>
-        </w:rPr>
-        <w:t xml:space="preserve"> </w:t>
-      </w:r>
-      <w:proofErr w:type="spellStart"/>
-      <w:r>
-        <w:rPr>
-          <w:rFonts w:cs="Times New Roman"/>
-        </w:rPr>
-        <w:t>данные</w:t>
-      </w:r>
-      <w:proofErr w:type="spellEnd"/>
-      <w:r>
-        <w:rPr>
-          <w:rFonts w:cs="Times New Roman"/>
-        </w:rPr>
-        <w:t>:</w:t>
+      <w:r>
+        <w:rPr>
+          <w:rFonts w:cs="Times New Roman"/>
+        </w:rPr>
+        <w:t>Таблица содержит следующие данные:</w:t>
       </w:r>
     </w:p>
     <w:p>
@@ -5220,14 +4828,12 @@
         </w:rPr>
         <w:t xml:space="preserve">Для выполнения задания использовался </w:t>
       </w:r>
-      <w:proofErr w:type="spellStart"/>
       <w:r>
         <w:rPr>
           <w:rFonts w:cs="Times New Roman"/>
         </w:rPr>
         <w:t>sql</w:t>
       </w:r>
-      <w:proofErr w:type="spellEnd"/>
       <w:r>
         <w:rPr>
           <w:rFonts w:cs="Times New Roman"/>
@@ -5267,27 +4873,7 @@
                 <w:szCs w:val="24"/>
                 <w:lang w:val="ru-RU"/>
               </w:rPr>
-              <w:t xml:space="preserve">-- Создать табличное </w:t>
-            </w:r>
-            <w:proofErr w:type="spellStart"/>
-            <w:r>
-              <w:rPr>
-                <w:rFonts w:ascii="Courier New" w:hAnsi="Courier New" w:cs="Courier New"/>
-                <w:sz w:val="24"/>
-                <w:szCs w:val="24"/>
-                <w:lang w:val="ru-RU"/>
-              </w:rPr>
-              <w:t>простарнство</w:t>
-            </w:r>
-            <w:proofErr w:type="spellEnd"/>
-            <w:r>
-              <w:rPr>
-                <w:rFonts w:ascii="Courier New" w:hAnsi="Courier New" w:cs="Courier New"/>
-                <w:sz w:val="24"/>
-                <w:szCs w:val="24"/>
-                <w:lang w:val="ru-RU"/>
-              </w:rPr>
-              <w:t xml:space="preserve"> и таблицу в нем --</w:t>
+              <w:t>-- Создать табличное простарнство и таблицу в нем --</w:t>
             </w:r>
           </w:p>
           <w:p>
@@ -5323,43 +4909,7 @@
                 <w:sz w:val="24"/>
                 <w:szCs w:val="24"/>
               </w:rPr>
-              <w:t>DATAFILE '/opt/oracle/</w:t>
-            </w:r>
-            <w:proofErr w:type="spellStart"/>
-            <w:r>
-              <w:rPr>
-                <w:rFonts w:ascii="Courier New" w:hAnsi="Courier New" w:cs="Courier New"/>
-                <w:sz w:val="24"/>
-                <w:szCs w:val="24"/>
-              </w:rPr>
-              <w:t>oradata</w:t>
-            </w:r>
-            <w:proofErr w:type="spellEnd"/>
-            <w:r>
-              <w:rPr>
-                <w:rFonts w:ascii="Courier New" w:hAnsi="Courier New" w:cs="Courier New"/>
-                <w:sz w:val="24"/>
-                <w:szCs w:val="24"/>
-              </w:rPr>
-              <w:t>/FREE/</w:t>
-            </w:r>
-            <w:proofErr w:type="spellStart"/>
-            <w:r>
-              <w:rPr>
-                <w:rFonts w:ascii="Courier New" w:hAnsi="Courier New" w:cs="Courier New"/>
-                <w:sz w:val="24"/>
-                <w:szCs w:val="24"/>
-              </w:rPr>
-              <w:t>aar_pdb</w:t>
-            </w:r>
-            <w:proofErr w:type="spellEnd"/>
-            <w:r>
-              <w:rPr>
-                <w:rFonts w:ascii="Courier New" w:hAnsi="Courier New" w:cs="Courier New"/>
-                <w:sz w:val="24"/>
-                <w:szCs w:val="24"/>
-              </w:rPr>
-              <w:t>/aar_qdata_01.dbf' SIZE 10M</w:t>
+              <w:t>DATAFILE '/opt/oracle/oradata/FREE/aar_pdb/aar_qdata_01.dbf' SIZE 10M</w:t>
             </w:r>
           </w:p>
           <w:p>
@@ -5644,14 +5194,12 @@
         </w:rPr>
         <w:t xml:space="preserve">: Выполнение </w:t>
       </w:r>
-      <w:proofErr w:type="spellStart"/>
       <w:r>
         <w:rPr>
           <w:rFonts w:cs="Times New Roman"/>
         </w:rPr>
         <w:t>sql</w:t>
       </w:r>
-      <w:proofErr w:type="spellEnd"/>
       <w:r>
         <w:rPr>
           <w:rFonts w:cs="Times New Roman"/>
@@ -5682,14 +5230,12 @@
         </w:rPr>
         <w:t xml:space="preserve">Результат выполнения </w:t>
       </w:r>
-      <w:proofErr w:type="spellStart"/>
       <w:r>
         <w:rPr>
           <w:rFonts w:cs="Times New Roman"/>
         </w:rPr>
         <w:t>sql</w:t>
       </w:r>
-      <w:proofErr w:type="spellEnd"/>
       <w:r>
         <w:rPr>
           <w:rFonts w:cs="Times New Roman"/>
@@ -5780,14 +5326,12 @@
         </w:rPr>
         <w:t xml:space="preserve">: Выполнение </w:t>
       </w:r>
-      <w:proofErr w:type="spellStart"/>
       <w:r>
         <w:rPr>
           <w:rFonts w:cs="Times New Roman"/>
         </w:rPr>
         <w:t>sql</w:t>
       </w:r>
-      <w:proofErr w:type="spellEnd"/>
       <w:r>
         <w:rPr>
           <w:rFonts w:cs="Times New Roman"/>
@@ -5952,53 +5496,12 @@
         </w:rPr>
         <w:t xml:space="preserve">1. </w:t>
       </w:r>
-      <w:proofErr w:type="spellStart"/>
       <w:r>
         <w:rPr>
           <w:rFonts w:ascii="Times New Roman" w:hAnsi="Times New Roman"/>
           <w:szCs w:val="28"/>
         </w:rPr>
-        <w:t>Определите</w:t>
-      </w:r>
-      <w:proofErr w:type="spellEnd"/>
-      <w:r>
-        <w:rPr>
-          <w:rFonts w:ascii="Times New Roman" w:hAnsi="Times New Roman"/>
-          <w:szCs w:val="28"/>
-        </w:rPr>
-        <w:t xml:space="preserve"> </w:t>
-      </w:r>
-      <w:proofErr w:type="spellStart"/>
-      <w:r>
-        <w:rPr>
-          <w:rFonts w:ascii="Times New Roman" w:hAnsi="Times New Roman"/>
-          <w:szCs w:val="28"/>
-        </w:rPr>
-        <w:t>остальные</w:t>
-      </w:r>
-      <w:proofErr w:type="spellEnd"/>
-      <w:r>
-        <w:rPr>
-          <w:rFonts w:ascii="Times New Roman" w:hAnsi="Times New Roman"/>
-          <w:szCs w:val="28"/>
-        </w:rPr>
-        <w:t xml:space="preserve"> </w:t>
-      </w:r>
-      <w:proofErr w:type="spellStart"/>
-      <w:r>
-        <w:rPr>
-          <w:rFonts w:ascii="Times New Roman" w:hAnsi="Times New Roman"/>
-          <w:szCs w:val="28"/>
-        </w:rPr>
-        <w:t>сегменты</w:t>
-      </w:r>
-      <w:proofErr w:type="spellEnd"/>
-      <w:r>
-        <w:rPr>
-          <w:rFonts w:ascii="Times New Roman" w:hAnsi="Times New Roman"/>
-          <w:szCs w:val="28"/>
-        </w:rPr>
-        <w:t>.</w:t>
+        <w:t>Определите остальные сегменты.</w:t>
       </w:r>
       <w:bookmarkEnd w:id="3"/>
     </w:p>
@@ -6017,14 +5520,12 @@
         </w:rPr>
         <w:t xml:space="preserve">Для выполнения задания использовался </w:t>
       </w:r>
-      <w:proofErr w:type="spellStart"/>
       <w:r>
         <w:rPr>
           <w:rFonts w:cs="Times New Roman"/>
         </w:rPr>
         <w:t>sql</w:t>
       </w:r>
-      <w:proofErr w:type="spellEnd"/>
       <w:r>
         <w:rPr>
           <w:rFonts w:cs="Times New Roman"/>
@@ -6076,61 +5577,7 @@
                 <w:sz w:val="24"/>
                 <w:szCs w:val="24"/>
               </w:rPr>
-              <w:t xml:space="preserve">-- </w:t>
-            </w:r>
-            <w:proofErr w:type="spellStart"/>
-            <w:r>
-              <w:rPr>
-                <w:rFonts w:ascii="Courier New" w:hAnsi="Courier New" w:cs="Courier New"/>
-                <w:sz w:val="24"/>
-                <w:szCs w:val="24"/>
-              </w:rPr>
-              <w:t>Получить</w:t>
-            </w:r>
-            <w:proofErr w:type="spellEnd"/>
-            <w:r>
-              <w:rPr>
-                <w:rFonts w:ascii="Courier New" w:hAnsi="Courier New" w:cs="Courier New"/>
-                <w:sz w:val="24"/>
-                <w:szCs w:val="24"/>
-              </w:rPr>
-              <w:t xml:space="preserve"> </w:t>
-            </w:r>
-            <w:proofErr w:type="spellStart"/>
-            <w:r>
-              <w:rPr>
-                <w:rFonts w:ascii="Courier New" w:hAnsi="Courier New" w:cs="Courier New"/>
-                <w:sz w:val="24"/>
-                <w:szCs w:val="24"/>
-              </w:rPr>
-              <w:t>список</w:t>
-            </w:r>
-            <w:proofErr w:type="spellEnd"/>
-            <w:r>
-              <w:rPr>
-                <w:rFonts w:ascii="Courier New" w:hAnsi="Courier New" w:cs="Courier New"/>
-                <w:sz w:val="24"/>
-                <w:szCs w:val="24"/>
-              </w:rPr>
-              <w:t xml:space="preserve"> </w:t>
-            </w:r>
-            <w:proofErr w:type="spellStart"/>
-            <w:r>
-              <w:rPr>
-                <w:rFonts w:ascii="Courier New" w:hAnsi="Courier New" w:cs="Courier New"/>
-                <w:sz w:val="24"/>
-                <w:szCs w:val="24"/>
-              </w:rPr>
-              <w:t>сегментов</w:t>
-            </w:r>
-            <w:proofErr w:type="spellEnd"/>
-            <w:r>
-              <w:rPr>
-                <w:rFonts w:ascii="Courier New" w:hAnsi="Courier New" w:cs="Courier New"/>
-                <w:sz w:val="24"/>
-                <w:szCs w:val="24"/>
-              </w:rPr>
-              <w:t xml:space="preserve"> -- </w:t>
+              <w:t xml:space="preserve">-- Получить список сегментов -- </w:t>
             </w:r>
           </w:p>
           <w:p>
@@ -6148,54 +5595,8 @@
                 <w:sz w:val="24"/>
                 <w:szCs w:val="24"/>
               </w:rPr>
-              <w:t xml:space="preserve">SELECT </w:t>
+              <w:t>SELECT segment_name, segment_type, bytes/1024 AS size_kb</w:t>
             </w:r>
-            <w:proofErr w:type="spellStart"/>
-            <w:r>
-              <w:rPr>
-                <w:rFonts w:ascii="Courier New" w:hAnsi="Courier New" w:cs="Courier New"/>
-                <w:sz w:val="24"/>
-                <w:szCs w:val="24"/>
-              </w:rPr>
-              <w:t>segment_name</w:t>
-            </w:r>
-            <w:proofErr w:type="spellEnd"/>
-            <w:r>
-              <w:rPr>
-                <w:rFonts w:ascii="Courier New" w:hAnsi="Courier New" w:cs="Courier New"/>
-                <w:sz w:val="24"/>
-                <w:szCs w:val="24"/>
-              </w:rPr>
-              <w:t xml:space="preserve">, </w:t>
-            </w:r>
-            <w:proofErr w:type="spellStart"/>
-            <w:r>
-              <w:rPr>
-                <w:rFonts w:ascii="Courier New" w:hAnsi="Courier New" w:cs="Courier New"/>
-                <w:sz w:val="24"/>
-                <w:szCs w:val="24"/>
-              </w:rPr>
-              <w:t>segment_type</w:t>
-            </w:r>
-            <w:proofErr w:type="spellEnd"/>
-            <w:r>
-              <w:rPr>
-                <w:rFonts w:ascii="Courier New" w:hAnsi="Courier New" w:cs="Courier New"/>
-                <w:sz w:val="24"/>
-                <w:szCs w:val="24"/>
-              </w:rPr>
-              <w:t xml:space="preserve">, bytes/1024 AS </w:t>
-            </w:r>
-            <w:proofErr w:type="spellStart"/>
-            <w:r>
-              <w:rPr>
-                <w:rFonts w:ascii="Courier New" w:hAnsi="Courier New" w:cs="Courier New"/>
-                <w:sz w:val="24"/>
-                <w:szCs w:val="24"/>
-              </w:rPr>
-              <w:t>size_kb</w:t>
-            </w:r>
-            <w:proofErr w:type="spellEnd"/>
           </w:p>
           <w:p>
             <w:pPr>
@@ -6212,18 +5613,8 @@
                 <w:sz w:val="24"/>
                 <w:szCs w:val="24"/>
               </w:rPr>
-              <w:t xml:space="preserve">FROM </w:t>
+              <w:t>FROM dba_segments</w:t>
             </w:r>
-            <w:proofErr w:type="spellStart"/>
-            <w:r>
-              <w:rPr>
-                <w:rFonts w:ascii="Courier New" w:hAnsi="Courier New" w:cs="Courier New"/>
-                <w:sz w:val="24"/>
-                <w:szCs w:val="24"/>
-              </w:rPr>
-              <w:t>dba_segments</w:t>
-            </w:r>
-            <w:proofErr w:type="spellEnd"/>
           </w:p>
           <w:p>
             <w:pPr>
@@ -6238,25 +5629,7 @@
                 <w:sz w:val="24"/>
                 <w:szCs w:val="24"/>
               </w:rPr>
-              <w:t xml:space="preserve">WHERE </w:t>
-            </w:r>
-            <w:proofErr w:type="spellStart"/>
-            <w:r>
-              <w:rPr>
-                <w:rFonts w:ascii="Courier New" w:hAnsi="Courier New" w:cs="Courier New"/>
-                <w:sz w:val="24"/>
-                <w:szCs w:val="24"/>
-              </w:rPr>
-              <w:t>tablespace_name</w:t>
-            </w:r>
-            <w:proofErr w:type="spellEnd"/>
-            <w:r>
-              <w:rPr>
-                <w:rFonts w:ascii="Courier New" w:hAnsi="Courier New" w:cs="Courier New"/>
-                <w:sz w:val="24"/>
-                <w:szCs w:val="24"/>
-              </w:rPr>
-              <w:t xml:space="preserve"> = 'AAR_QDATA';</w:t>
+              <w:t>WHERE tablespace_name = 'AAR_QDATA';</w:t>
             </w:r>
           </w:p>
         </w:tc>
@@ -6293,14 +5666,12 @@
         </w:rPr>
         <w:t xml:space="preserve">: Выполнение </w:t>
       </w:r>
-      <w:proofErr w:type="spellStart"/>
       <w:r>
         <w:rPr>
           <w:rFonts w:cs="Times New Roman"/>
         </w:rPr>
         <w:t>sql</w:t>
       </w:r>
-      <w:proofErr w:type="spellEnd"/>
       <w:r>
         <w:rPr>
           <w:rFonts w:cs="Times New Roman"/>
@@ -6331,14 +5702,12 @@
         </w:rPr>
         <w:t xml:space="preserve">Результат выполнения </w:t>
       </w:r>
-      <w:proofErr w:type="spellStart"/>
       <w:r>
         <w:rPr>
           <w:rFonts w:cs="Times New Roman"/>
         </w:rPr>
         <w:t>sql</w:t>
       </w:r>
-      <w:proofErr w:type="spellEnd"/>
       <w:r>
         <w:rPr>
           <w:rFonts w:cs="Times New Roman"/>
@@ -6443,14 +5812,12 @@
         </w:rPr>
         <w:t xml:space="preserve">: Выполнение </w:t>
       </w:r>
-      <w:proofErr w:type="spellStart"/>
       <w:r>
         <w:rPr>
           <w:rFonts w:cs="Times New Roman"/>
         </w:rPr>
         <w:t>sql</w:t>
       </w:r>
-      <w:proofErr w:type="spellEnd"/>
       <w:r>
         <w:rPr>
           <w:rFonts w:cs="Times New Roman"/>
@@ -6709,14 +6076,12 @@
         </w:rPr>
         <w:t xml:space="preserve">Для выполнения задания использовался </w:t>
       </w:r>
-      <w:proofErr w:type="spellStart"/>
       <w:r>
         <w:rPr>
           <w:rFonts w:cs="Times New Roman"/>
         </w:rPr>
         <w:t>sql</w:t>
       </w:r>
-      <w:proofErr w:type="spellEnd"/>
       <w:r>
         <w:rPr>
           <w:rFonts w:cs="Times New Roman"/>
@@ -6816,43 +6181,7 @@
                 <w:sz w:val="24"/>
                 <w:szCs w:val="24"/>
               </w:rPr>
-              <w:t xml:space="preserve">SELECT </w:t>
-            </w:r>
-            <w:proofErr w:type="spellStart"/>
-            <w:r>
-              <w:rPr>
-                <w:rFonts w:ascii="Courier New" w:hAnsi="Courier New" w:cs="Courier New"/>
-                <w:sz w:val="24"/>
-                <w:szCs w:val="24"/>
-              </w:rPr>
-              <w:t>segment_name</w:t>
-            </w:r>
-            <w:proofErr w:type="spellEnd"/>
-            <w:r>
-              <w:rPr>
-                <w:rFonts w:ascii="Courier New" w:hAnsi="Courier New" w:cs="Courier New"/>
-                <w:sz w:val="24"/>
-                <w:szCs w:val="24"/>
-              </w:rPr>
-              <w:t xml:space="preserve">, </w:t>
-            </w:r>
-            <w:proofErr w:type="spellStart"/>
-            <w:r>
-              <w:rPr>
-                <w:rFonts w:ascii="Courier New" w:hAnsi="Courier New" w:cs="Courier New"/>
-                <w:sz w:val="24"/>
-                <w:szCs w:val="24"/>
-              </w:rPr>
-              <w:t>segment_type</w:t>
-            </w:r>
-            <w:proofErr w:type="spellEnd"/>
-            <w:r>
-              <w:rPr>
-                <w:rFonts w:ascii="Courier New" w:hAnsi="Courier New" w:cs="Courier New"/>
-                <w:sz w:val="24"/>
-                <w:szCs w:val="24"/>
-              </w:rPr>
-              <w:t xml:space="preserve"> </w:t>
+              <w:t xml:space="preserve">SELECT segment_name, segment_type </w:t>
             </w:r>
           </w:p>
           <w:p>
@@ -6870,25 +6199,7 @@
                 <w:sz w:val="24"/>
                 <w:szCs w:val="24"/>
               </w:rPr>
-              <w:t xml:space="preserve">FROM </w:t>
-            </w:r>
-            <w:proofErr w:type="spellStart"/>
-            <w:r>
-              <w:rPr>
-                <w:rFonts w:ascii="Courier New" w:hAnsi="Courier New" w:cs="Courier New"/>
-                <w:sz w:val="24"/>
-                <w:szCs w:val="24"/>
-              </w:rPr>
-              <w:t>dba_segments</w:t>
-            </w:r>
-            <w:proofErr w:type="spellEnd"/>
-            <w:r>
-              <w:rPr>
-                <w:rFonts w:ascii="Courier New" w:hAnsi="Courier New" w:cs="Courier New"/>
-                <w:sz w:val="24"/>
-                <w:szCs w:val="24"/>
-              </w:rPr>
-              <w:t xml:space="preserve"> </w:t>
+              <w:t xml:space="preserve">FROM dba_segments </w:t>
             </w:r>
           </w:p>
           <w:p>
@@ -6906,25 +6217,7 @@
                 <w:sz w:val="24"/>
                 <w:szCs w:val="24"/>
               </w:rPr>
-              <w:t xml:space="preserve">WHERE </w:t>
-            </w:r>
-            <w:proofErr w:type="spellStart"/>
-            <w:r>
-              <w:rPr>
-                <w:rFonts w:ascii="Courier New" w:hAnsi="Courier New" w:cs="Courier New"/>
-                <w:sz w:val="24"/>
-                <w:szCs w:val="24"/>
-              </w:rPr>
-              <w:t>tablespace_name</w:t>
-            </w:r>
-            <w:proofErr w:type="spellEnd"/>
-            <w:r>
-              <w:rPr>
-                <w:rFonts w:ascii="Courier New" w:hAnsi="Courier New" w:cs="Courier New"/>
-                <w:sz w:val="24"/>
-                <w:szCs w:val="24"/>
-              </w:rPr>
-              <w:t xml:space="preserve"> = 'AAR_QDATA';</w:t>
+              <w:t>WHERE tablespace_name = 'AAR_QDATA';</w:t>
             </w:r>
           </w:p>
           <w:p>
@@ -6952,61 +6245,7 @@
                 <w:sz w:val="24"/>
                 <w:szCs w:val="24"/>
               </w:rPr>
-              <w:t xml:space="preserve">SELECT </w:t>
-            </w:r>
-            <w:proofErr w:type="spellStart"/>
-            <w:r>
-              <w:rPr>
-                <w:rFonts w:ascii="Courier New" w:hAnsi="Courier New" w:cs="Courier New"/>
-                <w:sz w:val="24"/>
-                <w:szCs w:val="24"/>
-              </w:rPr>
-              <w:t>object_name</w:t>
-            </w:r>
-            <w:proofErr w:type="spellEnd"/>
-            <w:r>
-              <w:rPr>
-                <w:rFonts w:ascii="Courier New" w:hAnsi="Courier New" w:cs="Courier New"/>
-                <w:sz w:val="24"/>
-                <w:szCs w:val="24"/>
-              </w:rPr>
-              <w:t xml:space="preserve">, </w:t>
-            </w:r>
-            <w:proofErr w:type="spellStart"/>
-            <w:r>
-              <w:rPr>
-                <w:rFonts w:ascii="Courier New" w:hAnsi="Courier New" w:cs="Courier New"/>
-                <w:sz w:val="24"/>
-                <w:szCs w:val="24"/>
-              </w:rPr>
-              <w:t>original_name</w:t>
-            </w:r>
-            <w:proofErr w:type="spellEnd"/>
-            <w:r>
-              <w:rPr>
-                <w:rFonts w:ascii="Courier New" w:hAnsi="Courier New" w:cs="Courier New"/>
-                <w:sz w:val="24"/>
-                <w:szCs w:val="24"/>
-              </w:rPr>
-              <w:t xml:space="preserve">, type, </w:t>
-            </w:r>
-            <w:proofErr w:type="spellStart"/>
-            <w:r>
-              <w:rPr>
-                <w:rFonts w:ascii="Courier New" w:hAnsi="Courier New" w:cs="Courier New"/>
-                <w:sz w:val="24"/>
-                <w:szCs w:val="24"/>
-              </w:rPr>
-              <w:t>droptime</w:t>
-            </w:r>
-            <w:proofErr w:type="spellEnd"/>
-            <w:r>
-              <w:rPr>
-                <w:rFonts w:ascii="Courier New" w:hAnsi="Courier New" w:cs="Courier New"/>
-                <w:sz w:val="24"/>
-                <w:szCs w:val="24"/>
-              </w:rPr>
-              <w:t xml:space="preserve"> </w:t>
+              <w:t xml:space="preserve">SELECT object_name, original_name, type, droptime </w:t>
             </w:r>
           </w:p>
           <w:p>
@@ -7022,25 +6261,7 @@
                 <w:sz w:val="24"/>
                 <w:szCs w:val="24"/>
               </w:rPr>
-              <w:t xml:space="preserve">FROM </w:t>
-            </w:r>
-            <w:proofErr w:type="spellStart"/>
-            <w:r>
-              <w:rPr>
-                <w:rFonts w:ascii="Courier New" w:hAnsi="Courier New" w:cs="Courier New"/>
-                <w:sz w:val="24"/>
-                <w:szCs w:val="24"/>
-              </w:rPr>
-              <w:t>user_recyclebin</w:t>
-            </w:r>
-            <w:proofErr w:type="spellEnd"/>
-            <w:r>
-              <w:rPr>
-                <w:rFonts w:ascii="Courier New" w:hAnsi="Courier New" w:cs="Courier New"/>
-                <w:sz w:val="24"/>
-                <w:szCs w:val="24"/>
-              </w:rPr>
-              <w:t>;</w:t>
+              <w:t>FROM user_recyclebin;</w:t>
             </w:r>
           </w:p>
         </w:tc>
@@ -7077,14 +6298,12 @@
         </w:rPr>
         <w:t xml:space="preserve">: Выполнение </w:t>
       </w:r>
-      <w:proofErr w:type="spellStart"/>
       <w:r>
         <w:rPr>
           <w:rFonts w:cs="Times New Roman"/>
         </w:rPr>
         <w:t>sql</w:t>
       </w:r>
-      <w:proofErr w:type="spellEnd"/>
       <w:r>
         <w:rPr>
           <w:rFonts w:cs="Times New Roman"/>
@@ -7115,14 +6334,12 @@
         </w:rPr>
         <w:t xml:space="preserve">Результат выполнения </w:t>
       </w:r>
-      <w:proofErr w:type="spellStart"/>
       <w:r>
         <w:rPr>
           <w:rFonts w:cs="Times New Roman"/>
         </w:rPr>
         <w:t>sql</w:t>
       </w:r>
-      <w:proofErr w:type="spellEnd"/>
       <w:r>
         <w:rPr>
           <w:rFonts w:cs="Times New Roman"/>
@@ -7248,14 +6465,12 @@
         </w:rPr>
         <w:t xml:space="preserve">: Выполнение </w:t>
       </w:r>
-      <w:proofErr w:type="spellStart"/>
       <w:r>
         <w:rPr>
           <w:rFonts w:cs="Times New Roman"/>
         </w:rPr>
         <w:t>sql</w:t>
       </w:r>
-      <w:proofErr w:type="spellEnd"/>
       <w:r>
         <w:rPr>
           <w:rFonts w:cs="Times New Roman"/>
@@ -7360,14 +6575,12 @@
         </w:rPr>
         <w:t xml:space="preserve">: Выполнение </w:t>
       </w:r>
-      <w:proofErr w:type="spellStart"/>
       <w:r>
         <w:rPr>
           <w:rFonts w:cs="Times New Roman"/>
         </w:rPr>
         <w:t>sql</w:t>
       </w:r>
-      <w:proofErr w:type="spellEnd"/>
       <w:r>
         <w:rPr>
           <w:rFonts w:cs="Times New Roman"/>
@@ -7519,48 +6732,14 @@
         </w:rPr>
       </w:pPr>
       <w:bookmarkStart w:id="5" w:name="_Toc240884222"/>
-      <w:proofErr w:type="spellStart"/>
       <w:r>
         <w:rPr>
           <w:rFonts w:ascii="Times New Roman" w:hAnsi="Times New Roman"/>
           <w:szCs w:val="28"/>
         </w:rPr>
         <w:lastRenderedPageBreak/>
-        <w:t>Восстановите</w:t>
-      </w:r>
-      <w:proofErr w:type="spellEnd"/>
-      <w:r>
-        <w:rPr>
-          <w:rFonts w:ascii="Times New Roman" w:hAnsi="Times New Roman"/>
-          <w:szCs w:val="28"/>
-        </w:rPr>
-        <w:t xml:space="preserve"> (FLASHBACK) </w:t>
-      </w:r>
-      <w:proofErr w:type="spellStart"/>
-      <w:r>
-        <w:rPr>
-          <w:rFonts w:ascii="Times New Roman" w:hAnsi="Times New Roman"/>
-          <w:szCs w:val="28"/>
-        </w:rPr>
-        <w:t>удаленную</w:t>
-      </w:r>
-      <w:proofErr w:type="spellEnd"/>
-      <w:r>
-        <w:rPr>
-          <w:rFonts w:ascii="Times New Roman" w:hAnsi="Times New Roman"/>
-          <w:szCs w:val="28"/>
-        </w:rPr>
-        <w:t xml:space="preserve"> </w:t>
-      </w:r>
-      <w:proofErr w:type="spellStart"/>
-      <w:r>
-        <w:rPr>
-          <w:rFonts w:ascii="Times New Roman" w:hAnsi="Times New Roman"/>
-          <w:szCs w:val="28"/>
-        </w:rPr>
-        <w:t>таблицу</w:t>
-      </w:r>
-      <w:proofErr w:type="spellEnd"/>
+        <w:t>Восстановите (FLASHBACK) удаленную таблицу</w:t>
+      </w:r>
       <w:r>
         <w:rPr>
           <w:rFonts w:ascii="Times New Roman" w:hAnsi="Times New Roman"/>
@@ -7586,14 +6765,12 @@
         </w:rPr>
         <w:t xml:space="preserve">Для выполнения задания использовался </w:t>
       </w:r>
-      <w:proofErr w:type="spellStart"/>
       <w:r>
         <w:rPr>
           <w:rFonts w:cs="Times New Roman"/>
         </w:rPr>
         <w:t>sql</w:t>
       </w:r>
-      <w:proofErr w:type="spellEnd"/>
       <w:r>
         <w:rPr>
           <w:rFonts w:cs="Times New Roman"/>
@@ -7742,54 +6919,8 @@
                 <w:sz w:val="24"/>
                 <w:szCs w:val="24"/>
               </w:rPr>
-              <w:t xml:space="preserve">SELECT </w:t>
+              <w:t>SELECT segment_name, segment_type, bytes/1024 AS size_kb</w:t>
             </w:r>
-            <w:proofErr w:type="spellStart"/>
-            <w:r>
-              <w:rPr>
-                <w:rFonts w:ascii="Courier New" w:hAnsi="Courier New" w:cs="Courier New"/>
-                <w:sz w:val="24"/>
-                <w:szCs w:val="24"/>
-              </w:rPr>
-              <w:t>segment_name</w:t>
-            </w:r>
-            <w:proofErr w:type="spellEnd"/>
-            <w:r>
-              <w:rPr>
-                <w:rFonts w:ascii="Courier New" w:hAnsi="Courier New" w:cs="Courier New"/>
-                <w:sz w:val="24"/>
-                <w:szCs w:val="24"/>
-              </w:rPr>
-              <w:t xml:space="preserve">, </w:t>
-            </w:r>
-            <w:proofErr w:type="spellStart"/>
-            <w:r>
-              <w:rPr>
-                <w:rFonts w:ascii="Courier New" w:hAnsi="Courier New" w:cs="Courier New"/>
-                <w:sz w:val="24"/>
-                <w:szCs w:val="24"/>
-              </w:rPr>
-              <w:t>segment_type</w:t>
-            </w:r>
-            <w:proofErr w:type="spellEnd"/>
-            <w:r>
-              <w:rPr>
-                <w:rFonts w:ascii="Courier New" w:hAnsi="Courier New" w:cs="Courier New"/>
-                <w:sz w:val="24"/>
-                <w:szCs w:val="24"/>
-              </w:rPr>
-              <w:t xml:space="preserve">, bytes/1024 AS </w:t>
-            </w:r>
-            <w:proofErr w:type="spellStart"/>
-            <w:r>
-              <w:rPr>
-                <w:rFonts w:ascii="Courier New" w:hAnsi="Courier New" w:cs="Courier New"/>
-                <w:sz w:val="24"/>
-                <w:szCs w:val="24"/>
-              </w:rPr>
-              <w:t>size_kb</w:t>
-            </w:r>
-            <w:proofErr w:type="spellEnd"/>
           </w:p>
           <w:p>
             <w:pPr>
@@ -7806,18 +6937,8 @@
                 <w:sz w:val="24"/>
                 <w:szCs w:val="24"/>
               </w:rPr>
-              <w:t xml:space="preserve">FROM </w:t>
+              <w:t>FROM dba_segments</w:t>
             </w:r>
-            <w:proofErr w:type="spellStart"/>
-            <w:r>
-              <w:rPr>
-                <w:rFonts w:ascii="Courier New" w:hAnsi="Courier New" w:cs="Courier New"/>
-                <w:sz w:val="24"/>
-                <w:szCs w:val="24"/>
-              </w:rPr>
-              <w:t>dba_segments</w:t>
-            </w:r>
-            <w:proofErr w:type="spellEnd"/>
           </w:p>
           <w:p>
             <w:pPr>
@@ -7832,25 +6953,7 @@
                 <w:sz w:val="24"/>
                 <w:szCs w:val="24"/>
               </w:rPr>
-              <w:t xml:space="preserve">WHERE </w:t>
-            </w:r>
-            <w:proofErr w:type="spellStart"/>
-            <w:r>
-              <w:rPr>
-                <w:rFonts w:ascii="Courier New" w:hAnsi="Courier New" w:cs="Courier New"/>
-                <w:sz w:val="24"/>
-                <w:szCs w:val="24"/>
-              </w:rPr>
-              <w:t>tablespace_name</w:t>
-            </w:r>
-            <w:proofErr w:type="spellEnd"/>
-            <w:r>
-              <w:rPr>
-                <w:rFonts w:ascii="Courier New" w:hAnsi="Courier New" w:cs="Courier New"/>
-                <w:sz w:val="24"/>
-                <w:szCs w:val="24"/>
-              </w:rPr>
-              <w:t xml:space="preserve"> = 'AAR_QDATA';</w:t>
+              <w:t>WHERE tablespace_name = 'AAR_QDATA';</w:t>
             </w:r>
           </w:p>
         </w:tc>
@@ -7887,14 +6990,12 @@
         </w:rPr>
         <w:t xml:space="preserve">: Выполнение </w:t>
       </w:r>
-      <w:proofErr w:type="spellStart"/>
       <w:r>
         <w:rPr>
           <w:rFonts w:cs="Times New Roman"/>
         </w:rPr>
         <w:t>sql</w:t>
       </w:r>
-      <w:proofErr w:type="spellEnd"/>
       <w:r>
         <w:rPr>
           <w:rFonts w:cs="Times New Roman"/>
@@ -7925,14 +7026,12 @@
         </w:rPr>
         <w:t xml:space="preserve">Результат выполнения </w:t>
       </w:r>
-      <w:proofErr w:type="spellStart"/>
       <w:r>
         <w:rPr>
           <w:rFonts w:cs="Times New Roman"/>
         </w:rPr>
         <w:t>sql</w:t>
       </w:r>
-      <w:proofErr w:type="spellEnd"/>
       <w:r>
         <w:rPr>
           <w:rFonts w:cs="Times New Roman"/>
@@ -8037,14 +7136,12 @@
         </w:rPr>
         <w:t xml:space="preserve">: Выполнение </w:t>
       </w:r>
-      <w:proofErr w:type="spellStart"/>
       <w:r>
         <w:rPr>
           <w:rFonts w:cs="Times New Roman"/>
         </w:rPr>
         <w:t>sql</w:t>
       </w:r>
-      <w:proofErr w:type="spellEnd"/>
       <w:r>
         <w:rPr>
           <w:rFonts w:cs="Times New Roman"/>
@@ -8246,14 +7343,12 @@
         </w:rPr>
         <w:t xml:space="preserve">Для выполнения задания использовался </w:t>
       </w:r>
-      <w:proofErr w:type="spellStart"/>
       <w:r>
         <w:rPr>
           <w:rFonts w:cs="Times New Roman"/>
         </w:rPr>
         <w:t>sql</w:t>
       </w:r>
-      <w:proofErr w:type="spellEnd"/>
       <w:r>
         <w:rPr>
           <w:rFonts w:cs="Times New Roman"/>
@@ -8305,61 +7400,7 @@
                 <w:sz w:val="24"/>
                 <w:szCs w:val="24"/>
               </w:rPr>
-              <w:t xml:space="preserve">-- </w:t>
-            </w:r>
-            <w:proofErr w:type="spellStart"/>
-            <w:r>
-              <w:rPr>
-                <w:rFonts w:ascii="Courier New" w:hAnsi="Courier New" w:cs="Courier New"/>
-                <w:sz w:val="24"/>
-                <w:szCs w:val="24"/>
-              </w:rPr>
-              <w:t>Заполнить</w:t>
-            </w:r>
-            <w:proofErr w:type="spellEnd"/>
-            <w:r>
-              <w:rPr>
-                <w:rFonts w:ascii="Courier New" w:hAnsi="Courier New" w:cs="Courier New"/>
-                <w:sz w:val="24"/>
-                <w:szCs w:val="24"/>
-              </w:rPr>
-              <w:t xml:space="preserve"> </w:t>
-            </w:r>
-            <w:proofErr w:type="spellStart"/>
-            <w:r>
-              <w:rPr>
-                <w:rFonts w:ascii="Courier New" w:hAnsi="Courier New" w:cs="Courier New"/>
-                <w:sz w:val="24"/>
-                <w:szCs w:val="24"/>
-              </w:rPr>
-              <w:t>данными</w:t>
-            </w:r>
-            <w:proofErr w:type="spellEnd"/>
-            <w:r>
-              <w:rPr>
-                <w:rFonts w:ascii="Courier New" w:hAnsi="Courier New" w:cs="Courier New"/>
-                <w:sz w:val="24"/>
-                <w:szCs w:val="24"/>
-              </w:rPr>
-              <w:t xml:space="preserve"> </w:t>
-            </w:r>
-            <w:proofErr w:type="spellStart"/>
-            <w:r>
-              <w:rPr>
-                <w:rFonts w:ascii="Courier New" w:hAnsi="Courier New" w:cs="Courier New"/>
-                <w:sz w:val="24"/>
-                <w:szCs w:val="24"/>
-              </w:rPr>
-              <w:t>таблицу</w:t>
-            </w:r>
-            <w:proofErr w:type="spellEnd"/>
-            <w:r>
-              <w:rPr>
-                <w:rFonts w:ascii="Courier New" w:hAnsi="Courier New" w:cs="Courier New"/>
-                <w:sz w:val="24"/>
-                <w:szCs w:val="24"/>
-              </w:rPr>
-              <w:t xml:space="preserve"> --</w:t>
+              <w:t>-- Заполнить данными таблицу --</w:t>
             </w:r>
           </w:p>
           <w:p>
@@ -8395,25 +7436,7 @@
                 <w:sz w:val="24"/>
                 <w:szCs w:val="24"/>
               </w:rPr>
-              <w:t xml:space="preserve">    FOR </w:t>
-            </w:r>
-            <w:proofErr w:type="spellStart"/>
-            <w:r>
-              <w:rPr>
-                <w:rFonts w:ascii="Courier New" w:hAnsi="Courier New" w:cs="Courier New"/>
-                <w:sz w:val="24"/>
-                <w:szCs w:val="24"/>
-              </w:rPr>
-              <w:t>i</w:t>
-            </w:r>
-            <w:proofErr w:type="spellEnd"/>
-            <w:r>
-              <w:rPr>
-                <w:rFonts w:ascii="Courier New" w:hAnsi="Courier New" w:cs="Courier New"/>
-                <w:sz w:val="24"/>
-                <w:szCs w:val="24"/>
-              </w:rPr>
-              <w:t xml:space="preserve"> IN 1..10000 LOOP</w:t>
+              <w:t xml:space="preserve">    FOR i IN 1..10000 LOOP</w:t>
             </w:r>
           </w:p>
           <w:p>
@@ -8461,7 +7484,6 @@
               </w:rPr>
               <w:t xml:space="preserve"> (</w:t>
             </w:r>
-            <w:proofErr w:type="spellStart"/>
             <w:r>
               <w:rPr>
                 <w:rFonts w:ascii="Courier New" w:hAnsi="Courier New" w:cs="Courier New"/>
@@ -8470,7 +7492,6 @@
               </w:rPr>
               <w:t>i</w:t>
             </w:r>
-            <w:proofErr w:type="spellEnd"/>
             <w:r>
               <w:rPr>
                 <w:rFonts w:ascii="Courier New" w:hAnsi="Courier New" w:cs="Courier New"/>
@@ -8480,7 +7501,6 @@
               </w:rPr>
               <w:t xml:space="preserve"> + 10, 'Сгенерированная строка ' || </w:t>
             </w:r>
-            <w:proofErr w:type="spellStart"/>
             <w:r>
               <w:rPr>
                 <w:rFonts w:ascii="Courier New" w:hAnsi="Courier New" w:cs="Courier New"/>
@@ -8489,7 +7509,6 @@
               </w:rPr>
               <w:t>i</w:t>
             </w:r>
-            <w:proofErr w:type="spellEnd"/>
             <w:r>
               <w:rPr>
                 <w:rFonts w:ascii="Courier New" w:hAnsi="Courier New" w:cs="Courier New"/>
@@ -8677,14 +7696,12 @@
         </w:rPr>
         <w:t xml:space="preserve">: Выполнение </w:t>
       </w:r>
-      <w:proofErr w:type="spellStart"/>
       <w:r>
         <w:rPr>
           <w:rFonts w:cs="Times New Roman"/>
         </w:rPr>
         <w:t>sql</w:t>
       </w:r>
-      <w:proofErr w:type="spellEnd"/>
       <w:r>
         <w:rPr>
           <w:rFonts w:cs="Times New Roman"/>
@@ -8715,14 +7732,12 @@
         </w:rPr>
         <w:t xml:space="preserve">Результат выполнения </w:t>
       </w:r>
-      <w:proofErr w:type="spellStart"/>
       <w:r>
         <w:rPr>
           <w:rFonts w:cs="Times New Roman"/>
         </w:rPr>
         <w:t>sql</w:t>
       </w:r>
-      <w:proofErr w:type="spellEnd"/>
       <w:r>
         <w:rPr>
           <w:rFonts w:cs="Times New Roman"/>
@@ -8827,14 +7842,12 @@
         </w:rPr>
         <w:t xml:space="preserve">: Выполнение </w:t>
       </w:r>
-      <w:proofErr w:type="spellStart"/>
       <w:r>
         <w:rPr>
           <w:rFonts w:cs="Times New Roman"/>
         </w:rPr>
         <w:t>sql</w:t>
       </w:r>
-      <w:proofErr w:type="spellEnd"/>
       <w:r>
         <w:rPr>
           <w:rFonts w:cs="Times New Roman"/>
@@ -9012,14 +8025,12 @@
         </w:rPr>
         <w:t xml:space="preserve">Для выполнения задания использовался </w:t>
       </w:r>
-      <w:proofErr w:type="spellStart"/>
       <w:r>
         <w:rPr>
           <w:rFonts w:cs="Times New Roman"/>
         </w:rPr>
         <w:t>sql</w:t>
       </w:r>
-      <w:proofErr w:type="spellEnd"/>
       <w:r>
         <w:rPr>
           <w:rFonts w:cs="Times New Roman"/>
@@ -9196,25 +8207,7 @@
                 <w:sz w:val="24"/>
                 <w:szCs w:val="24"/>
               </w:rPr>
-              <w:t xml:space="preserve">FROM </w:t>
-            </w:r>
-            <w:proofErr w:type="spellStart"/>
-            <w:r>
-              <w:rPr>
-                <w:rFonts w:ascii="Courier New" w:hAnsi="Courier New" w:cs="Courier New"/>
-                <w:sz w:val="24"/>
-                <w:szCs w:val="24"/>
-              </w:rPr>
-              <w:t>user_extents</w:t>
-            </w:r>
-            <w:proofErr w:type="spellEnd"/>
-            <w:r>
-              <w:rPr>
-                <w:rFonts w:ascii="Courier New" w:hAnsi="Courier New" w:cs="Courier New"/>
-                <w:sz w:val="24"/>
-                <w:szCs w:val="24"/>
-              </w:rPr>
-              <w:t xml:space="preserve"> </w:t>
+              <w:t xml:space="preserve">FROM user_extents </w:t>
             </w:r>
           </w:p>
           <w:p>
@@ -9232,25 +8225,7 @@
                 <w:sz w:val="24"/>
                 <w:szCs w:val="24"/>
               </w:rPr>
-              <w:t xml:space="preserve">    WHERE </w:t>
-            </w:r>
-            <w:proofErr w:type="spellStart"/>
-            <w:r>
-              <w:rPr>
-                <w:rFonts w:ascii="Courier New" w:hAnsi="Courier New" w:cs="Courier New"/>
-                <w:sz w:val="24"/>
-                <w:szCs w:val="24"/>
-              </w:rPr>
-              <w:t>segment_name</w:t>
-            </w:r>
-            <w:proofErr w:type="spellEnd"/>
-            <w:r>
-              <w:rPr>
-                <w:rFonts w:ascii="Courier New" w:hAnsi="Courier New" w:cs="Courier New"/>
-                <w:sz w:val="24"/>
-                <w:szCs w:val="24"/>
-              </w:rPr>
-              <w:t xml:space="preserve"> = 'AAR_T1'</w:t>
+              <w:t xml:space="preserve">    WHERE segment_name = 'AAR_T1'</w:t>
             </w:r>
           </w:p>
           <w:p>
@@ -9268,25 +8243,7 @@
                 <w:sz w:val="24"/>
                 <w:szCs w:val="24"/>
               </w:rPr>
-              <w:t xml:space="preserve">    ORDER BY </w:t>
-            </w:r>
-            <w:proofErr w:type="spellStart"/>
-            <w:r>
-              <w:rPr>
-                <w:rFonts w:ascii="Courier New" w:hAnsi="Courier New" w:cs="Courier New"/>
-                <w:sz w:val="24"/>
-                <w:szCs w:val="24"/>
-              </w:rPr>
-              <w:t>extent_id</w:t>
-            </w:r>
-            <w:proofErr w:type="spellEnd"/>
-            <w:r>
-              <w:rPr>
-                <w:rFonts w:ascii="Courier New" w:hAnsi="Courier New" w:cs="Courier New"/>
-                <w:sz w:val="24"/>
-                <w:szCs w:val="24"/>
-              </w:rPr>
-              <w:t>;</w:t>
+              <w:t xml:space="preserve">    ORDER BY extent_id;</w:t>
             </w:r>
           </w:p>
           <w:p>
@@ -9332,43 +8289,7 @@
                 <w:sz w:val="24"/>
                 <w:szCs w:val="24"/>
               </w:rPr>
-              <w:t xml:space="preserve">    COUNT(</w:t>
-            </w:r>
-            <w:proofErr w:type="spellStart"/>
-            <w:r>
-              <w:rPr>
-                <w:rFonts w:ascii="Courier New" w:hAnsi="Courier New" w:cs="Courier New"/>
-                <w:sz w:val="24"/>
-                <w:szCs w:val="24"/>
-              </w:rPr>
-              <w:t>extent_id</w:t>
-            </w:r>
-            <w:proofErr w:type="spellEnd"/>
-            <w:r>
-              <w:rPr>
-                <w:rFonts w:ascii="Courier New" w:hAnsi="Courier New" w:cs="Courier New"/>
-                <w:sz w:val="24"/>
-                <w:szCs w:val="24"/>
-              </w:rPr>
-              <w:t xml:space="preserve">) AS </w:t>
-            </w:r>
-            <w:proofErr w:type="spellStart"/>
-            <w:r>
-              <w:rPr>
-                <w:rFonts w:ascii="Courier New" w:hAnsi="Courier New" w:cs="Courier New"/>
-                <w:sz w:val="24"/>
-                <w:szCs w:val="24"/>
-              </w:rPr>
-              <w:t>total_extents</w:t>
-            </w:r>
-            <w:proofErr w:type="spellEnd"/>
-            <w:r>
-              <w:rPr>
-                <w:rFonts w:ascii="Courier New" w:hAnsi="Courier New" w:cs="Courier New"/>
-                <w:sz w:val="24"/>
-                <w:szCs w:val="24"/>
-              </w:rPr>
-              <w:t xml:space="preserve">, </w:t>
+              <w:t xml:space="preserve">    COUNT(extent_id) AS total_extents, </w:t>
             </w:r>
           </w:p>
           <w:p>
@@ -9386,25 +8307,7 @@
                 <w:sz w:val="24"/>
                 <w:szCs w:val="24"/>
               </w:rPr>
-              <w:t xml:space="preserve">    SUM(bytes) AS </w:t>
-            </w:r>
-            <w:proofErr w:type="spellStart"/>
-            <w:r>
-              <w:rPr>
-                <w:rFonts w:ascii="Courier New" w:hAnsi="Courier New" w:cs="Courier New"/>
-                <w:sz w:val="24"/>
-                <w:szCs w:val="24"/>
-              </w:rPr>
-              <w:t>total_bytes</w:t>
-            </w:r>
-            <w:proofErr w:type="spellEnd"/>
-            <w:r>
-              <w:rPr>
-                <w:rFonts w:ascii="Courier New" w:hAnsi="Courier New" w:cs="Courier New"/>
-                <w:sz w:val="24"/>
-                <w:szCs w:val="24"/>
-              </w:rPr>
-              <w:t xml:space="preserve">, </w:t>
+              <w:t xml:space="preserve">    SUM(bytes) AS total_bytes, </w:t>
             </w:r>
           </w:p>
           <w:p>
@@ -9422,25 +8325,7 @@
                 <w:sz w:val="24"/>
                 <w:szCs w:val="24"/>
               </w:rPr>
-              <w:t xml:space="preserve">    SUM(blocks) AS </w:t>
-            </w:r>
-            <w:proofErr w:type="spellStart"/>
-            <w:r>
-              <w:rPr>
-                <w:rFonts w:ascii="Courier New" w:hAnsi="Courier New" w:cs="Courier New"/>
-                <w:sz w:val="24"/>
-                <w:szCs w:val="24"/>
-              </w:rPr>
-              <w:t>total_blocks</w:t>
-            </w:r>
-            <w:proofErr w:type="spellEnd"/>
-            <w:r>
-              <w:rPr>
-                <w:rFonts w:ascii="Courier New" w:hAnsi="Courier New" w:cs="Courier New"/>
-                <w:sz w:val="24"/>
-                <w:szCs w:val="24"/>
-              </w:rPr>
-              <w:t xml:space="preserve"> </w:t>
+              <w:t xml:space="preserve">    SUM(blocks) AS total_blocks </w:t>
             </w:r>
           </w:p>
           <w:p>
@@ -9458,25 +8343,7 @@
                 <w:sz w:val="24"/>
                 <w:szCs w:val="24"/>
               </w:rPr>
-              <w:t xml:space="preserve">    FROM </w:t>
-            </w:r>
-            <w:proofErr w:type="spellStart"/>
-            <w:r>
-              <w:rPr>
-                <w:rFonts w:ascii="Courier New" w:hAnsi="Courier New" w:cs="Courier New"/>
-                <w:sz w:val="24"/>
-                <w:szCs w:val="24"/>
-              </w:rPr>
-              <w:t>user_extents</w:t>
-            </w:r>
-            <w:proofErr w:type="spellEnd"/>
-            <w:r>
-              <w:rPr>
-                <w:rFonts w:ascii="Courier New" w:hAnsi="Courier New" w:cs="Courier New"/>
-                <w:sz w:val="24"/>
-                <w:szCs w:val="24"/>
-              </w:rPr>
-              <w:t xml:space="preserve"> </w:t>
+              <w:t xml:space="preserve">    FROM user_extents </w:t>
             </w:r>
           </w:p>
           <w:p>
@@ -9492,25 +8359,7 @@
                 <w:sz w:val="24"/>
                 <w:szCs w:val="24"/>
               </w:rPr>
-              <w:t xml:space="preserve">    WHERE </w:t>
-            </w:r>
-            <w:proofErr w:type="spellStart"/>
-            <w:r>
-              <w:rPr>
-                <w:rFonts w:ascii="Courier New" w:hAnsi="Courier New" w:cs="Courier New"/>
-                <w:sz w:val="24"/>
-                <w:szCs w:val="24"/>
-              </w:rPr>
-              <w:t>segment_name</w:t>
-            </w:r>
-            <w:proofErr w:type="spellEnd"/>
-            <w:r>
-              <w:rPr>
-                <w:rFonts w:ascii="Courier New" w:hAnsi="Courier New" w:cs="Courier New"/>
-                <w:sz w:val="24"/>
-                <w:szCs w:val="24"/>
-              </w:rPr>
-              <w:t xml:space="preserve"> = 'AAR_T1';</w:t>
+              <w:t xml:space="preserve">    WHERE segment_name = 'AAR_T1';</w:t>
             </w:r>
             <w:r>
               <w:rPr>
@@ -9555,14 +8404,12 @@
         </w:rPr>
         <w:t xml:space="preserve">: Выполнение </w:t>
       </w:r>
-      <w:proofErr w:type="spellStart"/>
       <w:r>
         <w:rPr>
           <w:rFonts w:cs="Times New Roman"/>
         </w:rPr>
         <w:t>sql</w:t>
       </w:r>
-      <w:proofErr w:type="spellEnd"/>
       <w:r>
         <w:rPr>
           <w:rFonts w:cs="Times New Roman"/>
@@ -9593,14 +8440,12 @@
         </w:rPr>
         <w:t xml:space="preserve">Результат выполнения </w:t>
       </w:r>
-      <w:proofErr w:type="spellStart"/>
       <w:r>
         <w:rPr>
           <w:rFonts w:cs="Times New Roman"/>
         </w:rPr>
         <w:t>sql</w:t>
       </w:r>
-      <w:proofErr w:type="spellEnd"/>
       <w:r>
         <w:rPr>
           <w:rFonts w:cs="Times New Roman"/>
@@ -9719,14 +8564,12 @@
         </w:rPr>
         <w:t xml:space="preserve">: Выполнение </w:t>
       </w:r>
-      <w:proofErr w:type="spellStart"/>
       <w:r>
         <w:rPr>
           <w:rFonts w:cs="Times New Roman"/>
         </w:rPr>
         <w:t>sql</w:t>
       </w:r>
-      <w:proofErr w:type="spellEnd"/>
       <w:r>
         <w:rPr>
           <w:rFonts w:cs="Times New Roman"/>
@@ -9831,14 +8674,12 @@
         </w:rPr>
         <w:t xml:space="preserve">: Выполнение </w:t>
       </w:r>
-      <w:proofErr w:type="spellStart"/>
       <w:r>
         <w:rPr>
           <w:rFonts w:cs="Times New Roman"/>
         </w:rPr>
         <w:t>sql</w:t>
       </w:r>
-      <w:proofErr w:type="spellEnd"/>
       <w:r>
         <w:rPr>
           <w:rFonts w:cs="Times New Roman"/>
@@ -9977,14 +8818,12 @@
         </w:rPr>
         <w:t xml:space="preserve">Для выполнения задания использовался </w:t>
       </w:r>
-      <w:proofErr w:type="spellStart"/>
       <w:r>
         <w:rPr>
           <w:rFonts w:cs="Times New Roman"/>
         </w:rPr>
         <w:t>sql</w:t>
       </w:r>
-      <w:proofErr w:type="spellEnd"/>
       <w:r>
         <w:rPr>
           <w:rFonts w:cs="Times New Roman"/>
@@ -10084,25 +8923,7 @@
                 <w:sz w:val="24"/>
                 <w:szCs w:val="24"/>
               </w:rPr>
-              <w:t xml:space="preserve">SELECT </w:t>
-            </w:r>
-            <w:proofErr w:type="spellStart"/>
-            <w:r>
-              <w:rPr>
-                <w:rFonts w:ascii="Courier New" w:hAnsi="Courier New" w:cs="Courier New"/>
-                <w:sz w:val="24"/>
-                <w:szCs w:val="24"/>
-              </w:rPr>
-              <w:t>tablespace_name</w:t>
-            </w:r>
-            <w:proofErr w:type="spellEnd"/>
-            <w:r>
-              <w:rPr>
-                <w:rFonts w:ascii="Courier New" w:hAnsi="Courier New" w:cs="Courier New"/>
-                <w:sz w:val="24"/>
-                <w:szCs w:val="24"/>
-              </w:rPr>
-              <w:t xml:space="preserve"> </w:t>
+              <w:t xml:space="preserve">SELECT tablespace_name </w:t>
             </w:r>
           </w:p>
           <w:p>
@@ -10120,25 +8941,7 @@
                 <w:sz w:val="24"/>
                 <w:szCs w:val="24"/>
               </w:rPr>
-              <w:t xml:space="preserve">    FROM </w:t>
-            </w:r>
-            <w:proofErr w:type="spellStart"/>
-            <w:r>
-              <w:rPr>
-                <w:rFonts w:ascii="Courier New" w:hAnsi="Courier New" w:cs="Courier New"/>
-                <w:sz w:val="24"/>
-                <w:szCs w:val="24"/>
-              </w:rPr>
-              <w:t>dba_tablespaces</w:t>
-            </w:r>
-            <w:proofErr w:type="spellEnd"/>
-            <w:r>
-              <w:rPr>
-                <w:rFonts w:ascii="Courier New" w:hAnsi="Courier New" w:cs="Courier New"/>
-                <w:sz w:val="24"/>
-                <w:szCs w:val="24"/>
-              </w:rPr>
-              <w:t xml:space="preserve"> </w:t>
+              <w:t xml:space="preserve">    FROM dba_tablespaces </w:t>
             </w:r>
           </w:p>
           <w:p>
@@ -10154,25 +8957,7 @@
                 <w:sz w:val="24"/>
                 <w:szCs w:val="24"/>
               </w:rPr>
-              <w:t xml:space="preserve">    WHERE </w:t>
-            </w:r>
-            <w:proofErr w:type="spellStart"/>
-            <w:r>
-              <w:rPr>
-                <w:rFonts w:ascii="Courier New" w:hAnsi="Courier New" w:cs="Courier New"/>
-                <w:sz w:val="24"/>
-                <w:szCs w:val="24"/>
-              </w:rPr>
-              <w:t>tablespace_name</w:t>
-            </w:r>
-            <w:proofErr w:type="spellEnd"/>
-            <w:r>
-              <w:rPr>
-                <w:rFonts w:ascii="Courier New" w:hAnsi="Courier New" w:cs="Courier New"/>
-                <w:sz w:val="24"/>
-                <w:szCs w:val="24"/>
-              </w:rPr>
-              <w:t xml:space="preserve"> = 'AAR_QDATA';</w:t>
+              <w:t xml:space="preserve">    WHERE tablespace_name = 'AAR_QDATA';</w:t>
             </w:r>
           </w:p>
         </w:tc>
@@ -10209,14 +8994,12 @@
         </w:rPr>
         <w:t xml:space="preserve">: Выполнение </w:t>
       </w:r>
-      <w:proofErr w:type="spellStart"/>
       <w:r>
         <w:rPr>
           <w:rFonts w:cs="Times New Roman"/>
         </w:rPr>
         <w:t>sql</w:t>
       </w:r>
-      <w:proofErr w:type="spellEnd"/>
       <w:r>
         <w:rPr>
           <w:rFonts w:cs="Times New Roman"/>
@@ -10247,14 +9030,12 @@
         </w:rPr>
         <w:t xml:space="preserve">Результат выполнения </w:t>
       </w:r>
-      <w:proofErr w:type="spellStart"/>
       <w:r>
         <w:rPr>
           <w:rFonts w:cs="Times New Roman"/>
         </w:rPr>
         <w:t>sql</w:t>
       </w:r>
-      <w:proofErr w:type="spellEnd"/>
       <w:r>
         <w:rPr>
           <w:rFonts w:cs="Times New Roman"/>
@@ -10359,14 +9140,12 @@
         </w:rPr>
         <w:t xml:space="preserve">: Выполнение </w:t>
       </w:r>
-      <w:proofErr w:type="spellStart"/>
       <w:r>
         <w:rPr>
           <w:rFonts w:cs="Times New Roman"/>
         </w:rPr>
         <w:t>sql</w:t>
       </w:r>
-      <w:proofErr w:type="spellEnd"/>
       <w:r>
         <w:rPr>
           <w:rFonts w:cs="Times New Roman"/>
@@ -10490,14 +9269,12 @@
         </w:rPr>
         <w:t xml:space="preserve">Для выполнения задания использовался </w:t>
       </w:r>
-      <w:proofErr w:type="spellStart"/>
       <w:r>
         <w:rPr>
           <w:rFonts w:cs="Times New Roman"/>
         </w:rPr>
         <w:t>sql</w:t>
       </w:r>
-      <w:proofErr w:type="spellEnd"/>
       <w:r>
         <w:rPr>
           <w:rFonts w:cs="Times New Roman"/>
@@ -10569,25 +9346,7 @@
                 <w:sz w:val="24"/>
                 <w:szCs w:val="24"/>
               </w:rPr>
-              <w:t xml:space="preserve">SELECT group#, members, bytes/1024/1024 AS </w:t>
-            </w:r>
-            <w:proofErr w:type="spellStart"/>
-            <w:r>
-              <w:rPr>
-                <w:rFonts w:ascii="Courier New" w:hAnsi="Courier New" w:cs="Courier New"/>
-                <w:sz w:val="24"/>
-                <w:szCs w:val="24"/>
-              </w:rPr>
-              <w:t>size_mb</w:t>
-            </w:r>
-            <w:proofErr w:type="spellEnd"/>
-            <w:r>
-              <w:rPr>
-                <w:rFonts w:ascii="Courier New" w:hAnsi="Courier New" w:cs="Courier New"/>
-                <w:sz w:val="24"/>
-                <w:szCs w:val="24"/>
-              </w:rPr>
-              <w:t xml:space="preserve">, status, archived </w:t>
+              <w:t xml:space="preserve">SELECT group#, members, bytes/1024/1024 AS size_mb, status, archived </w:t>
             </w:r>
           </w:p>
           <w:p>
@@ -10605,25 +9364,7 @@
                 <w:sz w:val="24"/>
                 <w:szCs w:val="24"/>
               </w:rPr>
-              <w:t xml:space="preserve">FROM </w:t>
-            </w:r>
-            <w:proofErr w:type="spellStart"/>
-            <w:r>
-              <w:rPr>
-                <w:rFonts w:ascii="Courier New" w:hAnsi="Courier New" w:cs="Courier New"/>
-                <w:sz w:val="24"/>
-                <w:szCs w:val="24"/>
-              </w:rPr>
-              <w:t>v$log</w:t>
-            </w:r>
-            <w:proofErr w:type="spellEnd"/>
-            <w:r>
-              <w:rPr>
-                <w:rFonts w:ascii="Courier New" w:hAnsi="Courier New" w:cs="Courier New"/>
-                <w:sz w:val="24"/>
-                <w:szCs w:val="24"/>
-              </w:rPr>
-              <w:t xml:space="preserve"> </w:t>
+              <w:t xml:space="preserve">FROM v$log </w:t>
             </w:r>
           </w:p>
           <w:p>
@@ -10687,25 +9428,7 @@
                 <w:sz w:val="24"/>
                 <w:szCs w:val="24"/>
               </w:rPr>
-              <w:t xml:space="preserve">FROM </w:t>
-            </w:r>
-            <w:proofErr w:type="spellStart"/>
-            <w:r>
-              <w:rPr>
-                <w:rFonts w:ascii="Courier New" w:hAnsi="Courier New" w:cs="Courier New"/>
-                <w:sz w:val="24"/>
-                <w:szCs w:val="24"/>
-              </w:rPr>
-              <w:t>v$log</w:t>
-            </w:r>
-            <w:proofErr w:type="spellEnd"/>
-            <w:r>
-              <w:rPr>
-                <w:rFonts w:ascii="Courier New" w:hAnsi="Courier New" w:cs="Courier New"/>
-                <w:sz w:val="24"/>
-                <w:szCs w:val="24"/>
-              </w:rPr>
-              <w:t xml:space="preserve"> </w:t>
+              <w:t xml:space="preserve">FROM v$log </w:t>
             </w:r>
           </w:p>
           <w:p>
@@ -10758,14 +9481,12 @@
         </w:rPr>
         <w:t xml:space="preserve">: Выполнение </w:t>
       </w:r>
-      <w:proofErr w:type="spellStart"/>
       <w:r>
         <w:rPr>
           <w:rFonts w:cs="Times New Roman"/>
         </w:rPr>
         <w:t>sql</w:t>
       </w:r>
-      <w:proofErr w:type="spellEnd"/>
       <w:r>
         <w:rPr>
           <w:rFonts w:cs="Times New Roman"/>
@@ -10796,14 +9517,12 @@
         </w:rPr>
         <w:t xml:space="preserve">Результат выполнения </w:t>
       </w:r>
-      <w:proofErr w:type="spellStart"/>
       <w:r>
         <w:rPr>
           <w:rFonts w:cs="Times New Roman"/>
         </w:rPr>
         <w:t>sql</w:t>
       </w:r>
-      <w:proofErr w:type="spellEnd"/>
       <w:r>
         <w:rPr>
           <w:rFonts w:cs="Times New Roman"/>
@@ -10845,14 +9564,13 @@
       <w:r>
         <w:rPr>
           <w:rFonts w:cs="Times New Roman"/>
-          <w:noProof/>
           <w:lang w:val="ru-RU"/>
         </w:rPr>
         <w:drawing>
-          <wp:inline distT="0" distB="0" distL="0" distR="0" wp14:anchorId="5A34F64D" wp14:editId="3CD9C974">
-            <wp:extent cx="1524000" cy="914400"/>
-            <wp:effectExtent l="0" t="0" r="0" b="0"/>
-            <wp:docPr id="57" name="Рисунок 57"/>
+          <wp:inline distT="0" distB="0" distL="0" distR="0" wp14:anchorId="109BA737" wp14:editId="3E6A9557">
+            <wp:extent cx="3334215" cy="752580"/>
+            <wp:effectExtent l="0" t="0" r="0" b="9525"/>
+            <wp:docPr id="5" name="Рисунок 5"/>
             <wp:cNvGraphicFramePr>
               <a:graphicFrameLocks xmlns:a="http://schemas.openxmlformats.org/drawingml/2006/main" noChangeAspect="1"/>
             </wp:cNvGraphicFramePr>
@@ -10872,7 +9590,7 @@
                   <pic:spPr>
                     <a:xfrm>
                       <a:off x="0" y="0"/>
-                      <a:ext cx="1534113" cy="920468"/>
+                      <a:ext cx="3334215" cy="752580"/>
                     </a:xfrm>
                     <a:prstGeom prst="rect">
                       <a:avLst/>
@@ -10922,14 +9640,12 @@
         </w:rPr>
         <w:t xml:space="preserve">: Выполнение </w:t>
       </w:r>
-      <w:proofErr w:type="spellStart"/>
       <w:r>
         <w:rPr>
           <w:rFonts w:cs="Times New Roman"/>
         </w:rPr>
         <w:t>sql</w:t>
       </w:r>
-      <w:proofErr w:type="spellEnd"/>
       <w:r>
         <w:rPr>
           <w:rFonts w:cs="Times New Roman"/>
@@ -11041,14 +9757,12 @@
         </w:rPr>
         <w:t xml:space="preserve">Для выполнения задания использовался </w:t>
       </w:r>
-      <w:proofErr w:type="spellStart"/>
       <w:r>
         <w:rPr>
           <w:rFonts w:cs="Times New Roman"/>
         </w:rPr>
         <w:t>sql</w:t>
       </w:r>
-      <w:proofErr w:type="spellEnd"/>
       <w:r>
         <w:rPr>
           <w:rFonts w:cs="Times New Roman"/>
@@ -11136,25 +9850,7 @@
                 <w:sz w:val="24"/>
                 <w:szCs w:val="24"/>
               </w:rPr>
-              <w:t xml:space="preserve">    FROM </w:t>
-            </w:r>
-            <w:proofErr w:type="spellStart"/>
-            <w:r>
-              <w:rPr>
-                <w:rFonts w:ascii="Courier New" w:hAnsi="Courier New" w:cs="Courier New"/>
-                <w:sz w:val="24"/>
-                <w:szCs w:val="24"/>
-              </w:rPr>
-              <w:t>v$logfile</w:t>
-            </w:r>
-            <w:proofErr w:type="spellEnd"/>
-            <w:r>
-              <w:rPr>
-                <w:rFonts w:ascii="Courier New" w:hAnsi="Courier New" w:cs="Courier New"/>
-                <w:sz w:val="24"/>
-                <w:szCs w:val="24"/>
-              </w:rPr>
-              <w:t>;</w:t>
+              <w:t xml:space="preserve">    FROM v$logfile;</w:t>
             </w:r>
           </w:p>
         </w:tc>
@@ -11191,14 +9887,12 @@
         </w:rPr>
         <w:t xml:space="preserve">: Выполнение </w:t>
       </w:r>
-      <w:proofErr w:type="spellStart"/>
       <w:r>
         <w:rPr>
           <w:rFonts w:cs="Times New Roman"/>
         </w:rPr>
         <w:t>sql</w:t>
       </w:r>
-      <w:proofErr w:type="spellEnd"/>
       <w:r>
         <w:rPr>
           <w:rFonts w:cs="Times New Roman"/>
@@ -11229,14 +9923,12 @@
         </w:rPr>
         <w:t xml:space="preserve">Результат выполнения </w:t>
       </w:r>
-      <w:proofErr w:type="spellStart"/>
       <w:r>
         <w:rPr>
           <w:rFonts w:cs="Times New Roman"/>
         </w:rPr>
         <w:t>sql</w:t>
       </w:r>
-      <w:proofErr w:type="spellEnd"/>
       <w:r>
         <w:rPr>
           <w:rFonts w:cs="Times New Roman"/>
@@ -11348,14 +10040,12 @@
         </w:rPr>
         <w:t xml:space="preserve">: Выполнение </w:t>
       </w:r>
-      <w:proofErr w:type="spellStart"/>
       <w:r>
         <w:rPr>
           <w:rFonts w:cs="Times New Roman"/>
         </w:rPr>
         <w:t>sql</w:t>
       </w:r>
-      <w:proofErr w:type="spellEnd"/>
       <w:r>
         <w:rPr>
           <w:rFonts w:cs="Times New Roman"/>
@@ -11461,14 +10151,12 @@
         </w:rPr>
         <w:t xml:space="preserve">Для выполнения задания использовался </w:t>
       </w:r>
-      <w:proofErr w:type="spellStart"/>
       <w:r>
         <w:rPr>
           <w:rFonts w:cs="Times New Roman"/>
         </w:rPr>
         <w:t>sql</w:t>
       </w:r>
-      <w:proofErr w:type="spellEnd"/>
       <w:r>
         <w:rPr>
           <w:rFonts w:cs="Times New Roman"/>
@@ -11522,27 +10210,7 @@
                 <w:szCs w:val="24"/>
                 <w:lang w:val="ru-RU"/>
               </w:rPr>
-              <w:t xml:space="preserve">-- Пройти полный цикл переключений, записать серверное время в </w:t>
-            </w:r>
-            <w:proofErr w:type="spellStart"/>
-            <w:r>
-              <w:rPr>
-                <w:rFonts w:ascii="Courier New" w:hAnsi="Courier New" w:cs="Courier New"/>
-                <w:sz w:val="24"/>
-                <w:szCs w:val="24"/>
-                <w:lang w:val="ru-RU"/>
-              </w:rPr>
-              <w:t>моментт</w:t>
-            </w:r>
-            <w:proofErr w:type="spellEnd"/>
-            <w:r>
-              <w:rPr>
-                <w:rFonts w:ascii="Courier New" w:hAnsi="Courier New" w:cs="Courier New"/>
-                <w:sz w:val="24"/>
-                <w:szCs w:val="24"/>
-                <w:lang w:val="ru-RU"/>
-              </w:rPr>
-              <w:t xml:space="preserve"> первого подключения --</w:t>
+              <w:t>-- Пройти полный цикл переключений, записать серверное время в моментт первого подключения --</w:t>
             </w:r>
           </w:p>
           <w:p>
@@ -11560,25 +10228,7 @@
                 <w:sz w:val="24"/>
                 <w:szCs w:val="24"/>
               </w:rPr>
-              <w:t xml:space="preserve">SELECT TO_CHAR(SYSDATE, 'DD-MM-YYYY HH24:MI:SS') AS </w:t>
-            </w:r>
-            <w:proofErr w:type="spellStart"/>
-            <w:r>
-              <w:rPr>
-                <w:rFonts w:ascii="Courier New" w:hAnsi="Courier New" w:cs="Courier New"/>
-                <w:sz w:val="24"/>
-                <w:szCs w:val="24"/>
-              </w:rPr>
-              <w:t>server_time</w:t>
-            </w:r>
-            <w:proofErr w:type="spellEnd"/>
-            <w:r>
-              <w:rPr>
-                <w:rFonts w:ascii="Courier New" w:hAnsi="Courier New" w:cs="Courier New"/>
-                <w:sz w:val="24"/>
-                <w:szCs w:val="24"/>
-              </w:rPr>
-              <w:t xml:space="preserve"> FROM dual;</w:t>
+              <w:t>SELECT TO_CHAR(SYSDATE, 'DD-MM-YYYY HH24:MI:SS') AS server_time FROM dual;</w:t>
             </w:r>
           </w:p>
           <w:p>
@@ -11636,22 +10286,12 @@
                 <w:szCs w:val="24"/>
               </w:rPr>
             </w:pPr>
-            <w:r>
-              <w:rPr>
-                <w:rFonts w:ascii="Courier New" w:hAnsi="Courier New" w:cs="Courier New"/>
-                <w:sz w:val="24"/>
-                <w:szCs w:val="24"/>
-              </w:rPr>
-              <w:t>ALTER SYSTEM SWITCH LOGFILE;</w:t>
-            </w:r>
           </w:p>
           <w:p>
             <w:pPr>
               <w:ind w:firstLine="0"/>
               <w:rPr>
-                <w:rFonts w:ascii="Courier New" w:hAnsi="Courier New" w:cs="Courier New"/>
-                <w:sz w:val="24"/>
-                <w:szCs w:val="24"/>
+                <w:rFonts w:cs="Times New Roman"/>
               </w:rPr>
             </w:pPr>
             <w:r>
@@ -11660,51 +10300,7 @@
                 <w:sz w:val="24"/>
                 <w:szCs w:val="24"/>
               </w:rPr>
-              <w:t>ALTER SYSTEM SWITCH LOGFILE;</w:t>
-            </w:r>
-          </w:p>
-          <w:p>
-            <w:pPr>
-              <w:ind w:firstLine="0"/>
-              <w:rPr>
-                <w:rFonts w:ascii="Courier New" w:hAnsi="Courier New" w:cs="Courier New"/>
-                <w:sz w:val="24"/>
-                <w:szCs w:val="24"/>
-              </w:rPr>
-            </w:pPr>
-          </w:p>
-          <w:p>
-            <w:pPr>
-              <w:ind w:firstLine="0"/>
-              <w:rPr>
-                <w:rFonts w:cs="Times New Roman"/>
-              </w:rPr>
-            </w:pPr>
-            <w:r>
-              <w:rPr>
-                <w:rFonts w:ascii="Courier New" w:hAnsi="Courier New" w:cs="Courier New"/>
-                <w:sz w:val="24"/>
-                <w:szCs w:val="24"/>
-              </w:rPr>
-              <w:t xml:space="preserve">SELECT group#, status FROM </w:t>
-            </w:r>
-            <w:proofErr w:type="spellStart"/>
-            <w:r>
-              <w:rPr>
-                <w:rFonts w:ascii="Courier New" w:hAnsi="Courier New" w:cs="Courier New"/>
-                <w:sz w:val="24"/>
-                <w:szCs w:val="24"/>
-              </w:rPr>
-              <w:t>v$log</w:t>
-            </w:r>
-            <w:proofErr w:type="spellEnd"/>
-            <w:r>
-              <w:rPr>
-                <w:rFonts w:ascii="Courier New" w:hAnsi="Courier New" w:cs="Courier New"/>
-                <w:sz w:val="24"/>
-                <w:szCs w:val="24"/>
-              </w:rPr>
-              <w:t xml:space="preserve"> ORDER BY group#;</w:t>
+              <w:t>SELECT group#, status FROM v$log ORDER BY group#;</w:t>
             </w:r>
           </w:p>
         </w:tc>
@@ -11741,14 +10337,12 @@
         </w:rPr>
         <w:t xml:space="preserve">: Выполнение </w:t>
       </w:r>
-      <w:proofErr w:type="spellStart"/>
       <w:r>
         <w:rPr>
           <w:rFonts w:cs="Times New Roman"/>
         </w:rPr>
         <w:t>sql</w:t>
       </w:r>
-      <w:proofErr w:type="spellEnd"/>
       <w:r>
         <w:rPr>
           <w:rFonts w:cs="Times New Roman"/>
@@ -11779,14 +10373,12 @@
         </w:rPr>
         <w:t xml:space="preserve">Результат выполнения </w:t>
       </w:r>
-      <w:proofErr w:type="spellStart"/>
       <w:r>
         <w:rPr>
           <w:rFonts w:cs="Times New Roman"/>
         </w:rPr>
         <w:t>sql</w:t>
       </w:r>
-      <w:proofErr w:type="spellEnd"/>
       <w:r>
         <w:rPr>
           <w:rFonts w:cs="Times New Roman"/>
@@ -11891,14 +10483,12 @@
         </w:rPr>
         <w:t xml:space="preserve">: Выполнение </w:t>
       </w:r>
-      <w:proofErr w:type="spellStart"/>
       <w:r>
         <w:rPr>
           <w:rFonts w:cs="Times New Roman"/>
         </w:rPr>
         <w:t>sql</w:t>
       </w:r>
-      <w:proofErr w:type="spellEnd"/>
       <w:r>
         <w:rPr>
           <w:rFonts w:cs="Times New Roman"/>
@@ -12010,14 +10600,12 @@
         </w:rPr>
         <w:t xml:space="preserve">: Выполнение </w:t>
       </w:r>
-      <w:proofErr w:type="spellStart"/>
       <w:r>
         <w:rPr>
           <w:rFonts w:cs="Times New Roman"/>
         </w:rPr>
         <w:t>sql</w:t>
       </w:r>
-      <w:proofErr w:type="spellEnd"/>
       <w:r>
         <w:rPr>
           <w:rFonts w:cs="Times New Roman"/>
@@ -12106,37 +10694,12 @@
         <w:lastRenderedPageBreak/>
         <w:t xml:space="preserve">Создайте дополнительную группу журналов повтора с тремя файлами журнала. Убедитесь в наличии группы и файлов, а также в работоспособности группы (переключением). </w:t>
       </w:r>
-      <w:proofErr w:type="spellStart"/>
       <w:r>
         <w:rPr>
           <w:rFonts w:ascii="Times New Roman" w:hAnsi="Times New Roman"/>
           <w:szCs w:val="28"/>
         </w:rPr>
-        <w:t>Проследите</w:t>
-      </w:r>
-      <w:proofErr w:type="spellEnd"/>
-      <w:r>
-        <w:rPr>
-          <w:rFonts w:ascii="Times New Roman" w:hAnsi="Times New Roman"/>
-          <w:szCs w:val="28"/>
-        </w:rPr>
-        <w:t xml:space="preserve"> </w:t>
-      </w:r>
-      <w:proofErr w:type="spellStart"/>
-      <w:r>
-        <w:rPr>
-          <w:rFonts w:ascii="Times New Roman" w:hAnsi="Times New Roman"/>
-          <w:szCs w:val="28"/>
-        </w:rPr>
-        <w:t>последовательность</w:t>
-      </w:r>
-      <w:proofErr w:type="spellEnd"/>
-      <w:r>
-        <w:rPr>
-          <w:rFonts w:ascii="Times New Roman" w:hAnsi="Times New Roman"/>
-          <w:szCs w:val="28"/>
-        </w:rPr>
-        <w:t xml:space="preserve"> SCN</w:t>
+        <w:t>Проследите последовательность SCN</w:t>
       </w:r>
       <w:r>
         <w:rPr>
@@ -12163,14 +10726,12 @@
         </w:rPr>
         <w:t xml:space="preserve">Для выполнения задания использовался </w:t>
       </w:r>
-      <w:proofErr w:type="spellStart"/>
       <w:r>
         <w:rPr>
           <w:rFonts w:cs="Times New Roman"/>
         </w:rPr>
         <w:t>sql</w:t>
       </w:r>
-      <w:proofErr w:type="spellEnd"/>
       <w:r>
         <w:rPr>
           <w:rFonts w:cs="Times New Roman"/>
@@ -12382,25 +10943,7 @@
                 <w:sz w:val="24"/>
                 <w:szCs w:val="24"/>
               </w:rPr>
-              <w:t xml:space="preserve">    '/opt/oracle/</w:t>
-            </w:r>
-            <w:proofErr w:type="spellStart"/>
-            <w:r>
-              <w:rPr>
-                <w:rFonts w:ascii="Courier New" w:hAnsi="Courier New" w:cs="Courier New"/>
-                <w:sz w:val="24"/>
-                <w:szCs w:val="24"/>
-              </w:rPr>
-              <w:t>oradata</w:t>
-            </w:r>
-            <w:proofErr w:type="spellEnd"/>
-            <w:r>
-              <w:rPr>
-                <w:rFonts w:ascii="Courier New" w:hAnsi="Courier New" w:cs="Courier New"/>
-                <w:sz w:val="24"/>
-                <w:szCs w:val="24"/>
-              </w:rPr>
-              <w:t>/FREE/redo_ext_a.log',</w:t>
+              <w:t xml:space="preserve">    '/opt/oracle/oradata/FREE/redo_ext_a.log',</w:t>
             </w:r>
           </w:p>
           <w:p>
@@ -12418,25 +10961,7 @@
                 <w:sz w:val="24"/>
                 <w:szCs w:val="24"/>
               </w:rPr>
-              <w:t xml:space="preserve">    '/opt/oracle/</w:t>
-            </w:r>
-            <w:proofErr w:type="spellStart"/>
-            <w:r>
-              <w:rPr>
-                <w:rFonts w:ascii="Courier New" w:hAnsi="Courier New" w:cs="Courier New"/>
-                <w:sz w:val="24"/>
-                <w:szCs w:val="24"/>
-              </w:rPr>
-              <w:t>oradata</w:t>
-            </w:r>
-            <w:proofErr w:type="spellEnd"/>
-            <w:r>
-              <w:rPr>
-                <w:rFonts w:ascii="Courier New" w:hAnsi="Courier New" w:cs="Courier New"/>
-                <w:sz w:val="24"/>
-                <w:szCs w:val="24"/>
-              </w:rPr>
-              <w:t>/FREE/redo_ext_b.log',</w:t>
+              <w:t xml:space="preserve">    '/opt/oracle/oradata/FREE/redo_ext_b.log',</w:t>
             </w:r>
           </w:p>
           <w:p>
@@ -12454,25 +10979,7 @@
                 <w:sz w:val="24"/>
                 <w:szCs w:val="24"/>
               </w:rPr>
-              <w:t xml:space="preserve">    '/opt/oracle/</w:t>
-            </w:r>
-            <w:proofErr w:type="spellStart"/>
-            <w:r>
-              <w:rPr>
-                <w:rFonts w:ascii="Courier New" w:hAnsi="Courier New" w:cs="Courier New"/>
-                <w:sz w:val="24"/>
-                <w:szCs w:val="24"/>
-              </w:rPr>
-              <w:t>oradata</w:t>
-            </w:r>
-            <w:proofErr w:type="spellEnd"/>
-            <w:r>
-              <w:rPr>
-                <w:rFonts w:ascii="Courier New" w:hAnsi="Courier New" w:cs="Courier New"/>
-                <w:sz w:val="24"/>
-                <w:szCs w:val="24"/>
-              </w:rPr>
-              <w:t>/FREE/redo_ext_c.log'</w:t>
+              <w:t xml:space="preserve">    '/opt/oracle/oradata/FREE/redo_ext_c.log'</w:t>
             </w:r>
           </w:p>
           <w:p>
@@ -12536,25 +11043,7 @@
                 <w:sz w:val="24"/>
                 <w:szCs w:val="24"/>
               </w:rPr>
-              <w:t xml:space="preserve">    FROM </w:t>
-            </w:r>
-            <w:proofErr w:type="spellStart"/>
-            <w:r>
-              <w:rPr>
-                <w:rFonts w:ascii="Courier New" w:hAnsi="Courier New" w:cs="Courier New"/>
-                <w:sz w:val="24"/>
-                <w:szCs w:val="24"/>
-              </w:rPr>
-              <w:t>v$log</w:t>
-            </w:r>
-            <w:proofErr w:type="spellEnd"/>
-            <w:r>
-              <w:rPr>
-                <w:rFonts w:ascii="Courier New" w:hAnsi="Courier New" w:cs="Courier New"/>
-                <w:sz w:val="24"/>
-                <w:szCs w:val="24"/>
-              </w:rPr>
-              <w:t>;</w:t>
+              <w:t xml:space="preserve">    FROM v$log;</w:t>
             </w:r>
           </w:p>
           <w:p>
@@ -12590,25 +11079,7 @@
                 <w:sz w:val="24"/>
                 <w:szCs w:val="24"/>
               </w:rPr>
-              <w:t xml:space="preserve">    FROM </w:t>
-            </w:r>
-            <w:proofErr w:type="spellStart"/>
-            <w:r>
-              <w:rPr>
-                <w:rFonts w:ascii="Courier New" w:hAnsi="Courier New" w:cs="Courier New"/>
-                <w:sz w:val="24"/>
-                <w:szCs w:val="24"/>
-              </w:rPr>
-              <w:t>v$logfile</w:t>
-            </w:r>
-            <w:proofErr w:type="spellEnd"/>
-            <w:r>
-              <w:rPr>
-                <w:rFonts w:ascii="Courier New" w:hAnsi="Courier New" w:cs="Courier New"/>
-                <w:sz w:val="24"/>
-                <w:szCs w:val="24"/>
-              </w:rPr>
-              <w:t>;</w:t>
+              <w:t xml:space="preserve">    FROM v$logfile;</w:t>
             </w:r>
           </w:p>
           <w:p>
@@ -12644,7 +11115,24 @@
                 <w:sz w:val="24"/>
                 <w:szCs w:val="24"/>
               </w:rPr>
-              <w:t xml:space="preserve">SELECT group#, status </w:t>
+              <w:t>SELECT group#, statu</w:t>
+            </w:r>
+            <w:r>
+              <w:rPr>
+                <w:rFonts w:ascii="Courier New" w:hAnsi="Courier New" w:cs="Courier New"/>
+                <w:sz w:val="24"/>
+                <w:szCs w:val="24"/>
+              </w:rPr>
+              <w:t>s</w:t>
+            </w:r>
+            <w:r>
+              <w:t>,</w:t>
+            </w:r>
+            <w:r>
+              <w:t xml:space="preserve"> </w:t>
+            </w:r>
+            <w:r>
+              <w:t xml:space="preserve"> first_change#, next_change#</w:t>
             </w:r>
           </w:p>
           <w:p>
@@ -12660,25 +11148,7 @@
                 <w:sz w:val="24"/>
                 <w:szCs w:val="24"/>
               </w:rPr>
-              <w:t xml:space="preserve">    FROM </w:t>
-            </w:r>
-            <w:proofErr w:type="spellStart"/>
-            <w:r>
-              <w:rPr>
-                <w:rFonts w:ascii="Courier New" w:hAnsi="Courier New" w:cs="Courier New"/>
-                <w:sz w:val="24"/>
-                <w:szCs w:val="24"/>
-              </w:rPr>
-              <w:t>v$log</w:t>
-            </w:r>
-            <w:proofErr w:type="spellEnd"/>
-            <w:r>
-              <w:rPr>
-                <w:rFonts w:ascii="Courier New" w:hAnsi="Courier New" w:cs="Courier New"/>
-                <w:sz w:val="24"/>
-                <w:szCs w:val="24"/>
-              </w:rPr>
-              <w:t>;</w:t>
+              <w:t xml:space="preserve">    FROM v$log;</w:t>
             </w:r>
           </w:p>
         </w:tc>
@@ -12715,14 +11185,12 @@
         </w:rPr>
         <w:t xml:space="preserve">: Выполнение </w:t>
       </w:r>
-      <w:proofErr w:type="spellStart"/>
       <w:r>
         <w:rPr>
           <w:rFonts w:cs="Times New Roman"/>
         </w:rPr>
         <w:t>sql</w:t>
       </w:r>
-      <w:proofErr w:type="spellEnd"/>
       <w:r>
         <w:rPr>
           <w:rFonts w:cs="Times New Roman"/>
@@ -12753,14 +11221,12 @@
         </w:rPr>
         <w:t xml:space="preserve">Результат выполнения </w:t>
       </w:r>
-      <w:proofErr w:type="spellStart"/>
       <w:r>
         <w:rPr>
           <w:rFonts w:cs="Times New Roman"/>
         </w:rPr>
         <w:t>sql</w:t>
       </w:r>
-      <w:proofErr w:type="spellEnd"/>
       <w:r>
         <w:rPr>
           <w:rFonts w:cs="Times New Roman"/>
@@ -12872,14 +11338,12 @@
         </w:rPr>
         <w:t xml:space="preserve">: Выполнение </w:t>
       </w:r>
-      <w:proofErr w:type="spellStart"/>
       <w:r>
         <w:rPr>
           <w:rFonts w:cs="Times New Roman"/>
         </w:rPr>
         <w:t>sql</w:t>
       </w:r>
-      <w:proofErr w:type="spellEnd"/>
       <w:r>
         <w:rPr>
           <w:rFonts w:cs="Times New Roman"/>
@@ -12984,14 +11448,12 @@
         </w:rPr>
         <w:t xml:space="preserve">: Выполнение </w:t>
       </w:r>
-      <w:proofErr w:type="spellStart"/>
       <w:r>
         <w:rPr>
           <w:rFonts w:cs="Times New Roman"/>
         </w:rPr>
         <w:t>sql</w:t>
       </w:r>
-      <w:proofErr w:type="spellEnd"/>
       <w:r>
         <w:rPr>
           <w:rFonts w:cs="Times New Roman"/>
@@ -13031,10 +11493,10 @@
         </w:rPr>
         <w:lastRenderedPageBreak/>
         <w:drawing>
-          <wp:inline distT="0" distB="0" distL="0" distR="0" wp14:anchorId="3B1AD3EB" wp14:editId="7BE31C7E">
-            <wp:extent cx="2292792" cy="1065474"/>
-            <wp:effectExtent l="0" t="0" r="0" b="1905"/>
-            <wp:docPr id="76" name="Рисунок 76"/>
+          <wp:inline distT="0" distB="0" distL="0" distR="0" wp14:anchorId="142D206F" wp14:editId="2241ED69">
+            <wp:extent cx="3839111" cy="714475"/>
+            <wp:effectExtent l="0" t="0" r="0" b="9525"/>
+            <wp:docPr id="3" name="Рисунок 3"/>
             <wp:cNvGraphicFramePr>
               <a:graphicFrameLocks xmlns:a="http://schemas.openxmlformats.org/drawingml/2006/main" noChangeAspect="1"/>
             </wp:cNvGraphicFramePr>
@@ -13054,7 +11516,7 @@
                   <pic:spPr>
                     <a:xfrm>
                       <a:off x="0" y="0"/>
-                      <a:ext cx="2301988" cy="1069747"/>
+                      <a:ext cx="3839111" cy="714475"/>
                     </a:xfrm>
                     <a:prstGeom prst="rect">
                       <a:avLst/>
@@ -13104,14 +11566,12 @@
         </w:rPr>
         <w:t xml:space="preserve">: Выполнение </w:t>
       </w:r>
-      <w:proofErr w:type="spellStart"/>
       <w:r>
         <w:rPr>
           <w:rFonts w:cs="Times New Roman"/>
         </w:rPr>
         <w:t>sql</w:t>
       </w:r>
-      <w:proofErr w:type="spellEnd"/>
       <w:r>
         <w:rPr>
           <w:rFonts w:cs="Times New Roman"/>
@@ -13223,14 +11683,12 @@
         </w:rPr>
         <w:t xml:space="preserve">Для выполнения задания использовался </w:t>
       </w:r>
-      <w:proofErr w:type="spellStart"/>
       <w:r>
         <w:rPr>
           <w:rFonts w:cs="Times New Roman"/>
         </w:rPr>
         <w:t>sql</w:t>
       </w:r>
-      <w:proofErr w:type="spellEnd"/>
       <w:r>
         <w:rPr>
           <w:rFonts w:cs="Times New Roman"/>
@@ -13352,25 +11810,7 @@
                 <w:sz w:val="24"/>
                 <w:szCs w:val="24"/>
               </w:rPr>
-              <w:t xml:space="preserve">SELECT group#, status FROM </w:t>
-            </w:r>
-            <w:proofErr w:type="spellStart"/>
-            <w:r>
-              <w:rPr>
-                <w:rFonts w:ascii="Courier New" w:hAnsi="Courier New" w:cs="Courier New"/>
-                <w:sz w:val="24"/>
-                <w:szCs w:val="24"/>
-              </w:rPr>
-              <w:t>v$log</w:t>
-            </w:r>
-            <w:proofErr w:type="spellEnd"/>
-            <w:r>
-              <w:rPr>
-                <w:rFonts w:ascii="Courier New" w:hAnsi="Courier New" w:cs="Courier New"/>
-                <w:sz w:val="24"/>
-                <w:szCs w:val="24"/>
-              </w:rPr>
-              <w:t>;</w:t>
+              <w:t>SELECT group#, status FROM v$log;</w:t>
             </w:r>
           </w:p>
           <w:p>
@@ -13433,14 +11873,12 @@
         </w:rPr>
         <w:t xml:space="preserve">: Выполнение </w:t>
       </w:r>
-      <w:proofErr w:type="spellStart"/>
       <w:r>
         <w:rPr>
           <w:rFonts w:cs="Times New Roman"/>
         </w:rPr>
         <w:t>sql</w:t>
       </w:r>
-      <w:proofErr w:type="spellEnd"/>
       <w:r>
         <w:rPr>
           <w:rFonts w:cs="Times New Roman"/>
@@ -13483,79 +11921,7 @@
                 <w:sz w:val="24"/>
                 <w:szCs w:val="24"/>
               </w:rPr>
-              <w:t xml:space="preserve">docker exec -it </w:t>
-            </w:r>
-            <w:proofErr w:type="spellStart"/>
-            <w:r>
-              <w:rPr>
-                <w:rFonts w:ascii="Courier New" w:hAnsi="Courier New" w:cs="Courier New"/>
-                <w:sz w:val="24"/>
-                <w:szCs w:val="24"/>
-              </w:rPr>
-              <w:t>aar</w:t>
-            </w:r>
-            <w:proofErr w:type="spellEnd"/>
-            <w:r>
-              <w:rPr>
-                <w:rFonts w:ascii="Courier New" w:hAnsi="Courier New" w:cs="Courier New"/>
-                <w:sz w:val="24"/>
-                <w:szCs w:val="24"/>
-              </w:rPr>
-              <w:t>-oracle rm /opt/oracle/</w:t>
-            </w:r>
-            <w:proofErr w:type="spellStart"/>
-            <w:r>
-              <w:rPr>
-                <w:rFonts w:ascii="Courier New" w:hAnsi="Courier New" w:cs="Courier New"/>
-                <w:sz w:val="24"/>
-                <w:szCs w:val="24"/>
-              </w:rPr>
-              <w:t>oradata</w:t>
-            </w:r>
-            <w:proofErr w:type="spellEnd"/>
-            <w:r>
-              <w:rPr>
-                <w:rFonts w:ascii="Courier New" w:hAnsi="Courier New" w:cs="Courier New"/>
-                <w:sz w:val="24"/>
-                <w:szCs w:val="24"/>
-              </w:rPr>
-              <w:t>/FREE/redo_ext_a.log /opt/oracle/</w:t>
-            </w:r>
-            <w:proofErr w:type="spellStart"/>
-            <w:r>
-              <w:rPr>
-                <w:rFonts w:ascii="Courier New" w:hAnsi="Courier New" w:cs="Courier New"/>
-                <w:sz w:val="24"/>
-                <w:szCs w:val="24"/>
-              </w:rPr>
-              <w:t>oradata</w:t>
-            </w:r>
-            <w:proofErr w:type="spellEnd"/>
-            <w:r>
-              <w:rPr>
-                <w:rFonts w:ascii="Courier New" w:hAnsi="Courier New" w:cs="Courier New"/>
-                <w:sz w:val="24"/>
-                <w:szCs w:val="24"/>
-              </w:rPr>
-              <w:t>/FREE/redo_ext_b.log /opt/oracle/</w:t>
-            </w:r>
-            <w:proofErr w:type="spellStart"/>
-            <w:r>
-              <w:rPr>
-                <w:rFonts w:ascii="Courier New" w:hAnsi="Courier New" w:cs="Courier New"/>
-                <w:sz w:val="24"/>
-                <w:szCs w:val="24"/>
-              </w:rPr>
-              <w:t>oradata</w:t>
-            </w:r>
-            <w:proofErr w:type="spellEnd"/>
-            <w:r>
-              <w:rPr>
-                <w:rFonts w:ascii="Courier New" w:hAnsi="Courier New" w:cs="Courier New"/>
-                <w:sz w:val="24"/>
-                <w:szCs w:val="24"/>
-              </w:rPr>
-              <w:t>/FREE/redo_ext_c.log</w:t>
+              <w:t>docker exec -it aar-oracle rm /opt/oracle/oradata/FREE/redo_ext_a.log /opt/oracle/oradata/FREE/redo_ext_b.log /opt/oracle/oradata/FREE/redo_ext_c.log</w:t>
             </w:r>
           </w:p>
         </w:tc>
@@ -13629,14 +11995,12 @@
         </w:rPr>
         <w:t xml:space="preserve">Результат выполнения </w:t>
       </w:r>
-      <w:proofErr w:type="spellStart"/>
       <w:r>
         <w:rPr>
           <w:rFonts w:cs="Times New Roman"/>
         </w:rPr>
         <w:t>sql</w:t>
       </w:r>
-      <w:proofErr w:type="spellEnd"/>
       <w:r>
         <w:rPr>
           <w:rFonts w:cs="Times New Roman"/>
@@ -13748,14 +12112,12 @@
         </w:rPr>
         <w:t xml:space="preserve">: Выполнение </w:t>
       </w:r>
-      <w:proofErr w:type="spellStart"/>
       <w:r>
         <w:rPr>
           <w:rFonts w:cs="Times New Roman"/>
         </w:rPr>
         <w:t>sql</w:t>
       </w:r>
-      <w:proofErr w:type="spellEnd"/>
       <w:r>
         <w:rPr>
           <w:rFonts w:cs="Times New Roman"/>
@@ -13867,14 +12229,12 @@
         </w:rPr>
         <w:t xml:space="preserve">: Выполнение </w:t>
       </w:r>
-      <w:proofErr w:type="spellStart"/>
       <w:r>
         <w:rPr>
           <w:rFonts w:cs="Times New Roman"/>
         </w:rPr>
         <w:t>sql</w:t>
       </w:r>
-      <w:proofErr w:type="spellEnd"/>
       <w:r>
         <w:rPr>
           <w:rFonts w:cs="Times New Roman"/>
@@ -14007,14 +12367,12 @@
         </w:rPr>
         <w:t xml:space="preserve">Для выполнения задания использовался </w:t>
       </w:r>
-      <w:proofErr w:type="spellStart"/>
       <w:r>
         <w:rPr>
           <w:rFonts w:cs="Times New Roman"/>
         </w:rPr>
         <w:t>sql</w:t>
       </w:r>
-      <w:proofErr w:type="spellEnd"/>
       <w:r>
         <w:rPr>
           <w:rFonts w:cs="Times New Roman"/>
@@ -14093,25 +12451,7 @@
                 <w:sz w:val="24"/>
                 <w:szCs w:val="24"/>
               </w:rPr>
-              <w:t xml:space="preserve">SELECT </w:t>
-            </w:r>
-            <w:proofErr w:type="spellStart"/>
-            <w:r>
-              <w:rPr>
-                <w:rFonts w:ascii="Courier New" w:hAnsi="Courier New" w:cs="Courier New"/>
-                <w:sz w:val="24"/>
-                <w:szCs w:val="24"/>
-              </w:rPr>
-              <w:t>log_mode</w:t>
-            </w:r>
-            <w:proofErr w:type="spellEnd"/>
-            <w:r>
-              <w:rPr>
-                <w:rFonts w:ascii="Courier New" w:hAnsi="Courier New" w:cs="Courier New"/>
-                <w:sz w:val="24"/>
-                <w:szCs w:val="24"/>
-              </w:rPr>
-              <w:t xml:space="preserve"> </w:t>
+              <w:t xml:space="preserve">SELECT log_mode </w:t>
             </w:r>
           </w:p>
           <w:p>
@@ -14127,25 +12467,7 @@
                 <w:sz w:val="24"/>
                 <w:szCs w:val="24"/>
               </w:rPr>
-              <w:t xml:space="preserve">    FROM </w:t>
-            </w:r>
-            <w:proofErr w:type="spellStart"/>
-            <w:r>
-              <w:rPr>
-                <w:rFonts w:ascii="Courier New" w:hAnsi="Courier New" w:cs="Courier New"/>
-                <w:sz w:val="24"/>
-                <w:szCs w:val="24"/>
-              </w:rPr>
-              <w:t>v$database</w:t>
-            </w:r>
-            <w:proofErr w:type="spellEnd"/>
-            <w:r>
-              <w:rPr>
-                <w:rFonts w:ascii="Courier New" w:hAnsi="Courier New" w:cs="Courier New"/>
-                <w:sz w:val="24"/>
-                <w:szCs w:val="24"/>
-              </w:rPr>
-              <w:t>;</w:t>
+              <w:t xml:space="preserve">    FROM v$database;</w:t>
             </w:r>
           </w:p>
         </w:tc>
@@ -14189,14 +12511,12 @@
         </w:rPr>
         <w:t xml:space="preserve">: Выполнение </w:t>
       </w:r>
-      <w:proofErr w:type="spellStart"/>
       <w:r>
         <w:rPr>
           <w:rFonts w:cs="Times New Roman"/>
         </w:rPr>
         <w:t>sql</w:t>
       </w:r>
-      <w:proofErr w:type="spellEnd"/>
       <w:r>
         <w:rPr>
           <w:rFonts w:cs="Times New Roman"/>
@@ -14227,14 +12547,12 @@
         </w:rPr>
         <w:t xml:space="preserve">Результат выполнения </w:t>
       </w:r>
-      <w:proofErr w:type="spellStart"/>
       <w:r>
         <w:rPr>
           <w:rFonts w:cs="Times New Roman"/>
         </w:rPr>
         <w:t>sql</w:t>
       </w:r>
-      <w:proofErr w:type="spellEnd"/>
       <w:r>
         <w:rPr>
           <w:rFonts w:cs="Times New Roman"/>
@@ -14269,6 +12587,7 @@
       <w:r>
         <w:rPr>
           <w:rFonts w:cs="Times New Roman"/>
+          <w:noProof/>
           <w:lang w:val="ru-RU"/>
         </w:rPr>
         <w:drawing>
@@ -14338,14 +12657,12 @@
         </w:rPr>
         <w:t xml:space="preserve">: Выполнение </w:t>
       </w:r>
-      <w:proofErr w:type="spellStart"/>
       <w:r>
         <w:rPr>
           <w:rFonts w:cs="Times New Roman"/>
         </w:rPr>
         <w:t>sql</w:t>
       </w:r>
-      <w:proofErr w:type="spellEnd"/>
       <w:r>
         <w:rPr>
           <w:rFonts w:cs="Times New Roman"/>
@@ -14466,10 +12783,17 @@
         <w:rPr>
           <w:rFonts w:ascii="Times New Roman" w:hAnsi="Times New Roman"/>
           <w:szCs w:val="28"/>
-          <w:lang w:val="ru-RU"/>
         </w:rPr>
         <w:lastRenderedPageBreak/>
-        <w:t>Определите, выполняется или нет архивирование журналов повтора (архивирование должно быть отключено, иначе дождитесь, пока другой студент выполнит задание и отключит).</w:t>
+        <w:t>Определите номер последнего архива</w:t>
+      </w:r>
+      <w:r>
+        <w:rPr>
+          <w:rFonts w:ascii="Times New Roman" w:hAnsi="Times New Roman"/>
+          <w:szCs w:val="28"/>
+          <w:lang w:val="ru-RU"/>
+        </w:rPr>
+        <w:t>.</w:t>
       </w:r>
       <w:bookmarkEnd w:id="15"/>
     </w:p>
@@ -14488,14 +12812,12 @@
         </w:rPr>
         <w:t xml:space="preserve">Для выполнения задания использовался </w:t>
       </w:r>
-      <w:proofErr w:type="spellStart"/>
       <w:r>
         <w:rPr>
           <w:rFonts w:cs="Times New Roman"/>
         </w:rPr>
         <w:t>sql</w:t>
       </w:r>
-      <w:proofErr w:type="spellEnd"/>
       <w:r>
         <w:rPr>
           <w:rFonts w:cs="Times New Roman"/>
@@ -14567,25 +12889,7 @@
                 <w:sz w:val="24"/>
                 <w:szCs w:val="24"/>
               </w:rPr>
-              <w:t xml:space="preserve">SELECT </w:t>
-            </w:r>
-            <w:proofErr w:type="spellStart"/>
-            <w:r>
-              <w:rPr>
-                <w:rFonts w:ascii="Courier New" w:hAnsi="Courier New" w:cs="Courier New"/>
-                <w:sz w:val="24"/>
-                <w:szCs w:val="24"/>
-              </w:rPr>
-              <w:t>log_mode</w:t>
-            </w:r>
-            <w:proofErr w:type="spellEnd"/>
-            <w:r>
-              <w:rPr>
-                <w:rFonts w:ascii="Courier New" w:hAnsi="Courier New" w:cs="Courier New"/>
-                <w:sz w:val="24"/>
-                <w:szCs w:val="24"/>
-              </w:rPr>
-              <w:t xml:space="preserve"> </w:t>
+              <w:t xml:space="preserve">SELECT log_mode </w:t>
             </w:r>
           </w:p>
           <w:p>
@@ -14601,25 +12905,7 @@
                 <w:sz w:val="24"/>
                 <w:szCs w:val="24"/>
               </w:rPr>
-              <w:t xml:space="preserve">    FROM </w:t>
-            </w:r>
-            <w:proofErr w:type="spellStart"/>
-            <w:r>
-              <w:rPr>
-                <w:rFonts w:ascii="Courier New" w:hAnsi="Courier New" w:cs="Courier New"/>
-                <w:sz w:val="24"/>
-                <w:szCs w:val="24"/>
-              </w:rPr>
-              <w:t>v$database</w:t>
-            </w:r>
-            <w:proofErr w:type="spellEnd"/>
-            <w:r>
-              <w:rPr>
-                <w:rFonts w:ascii="Courier New" w:hAnsi="Courier New" w:cs="Courier New"/>
-                <w:sz w:val="24"/>
-                <w:szCs w:val="24"/>
-              </w:rPr>
-              <w:t>;</w:t>
+              <w:t xml:space="preserve">    FROM v$database;</w:t>
             </w:r>
           </w:p>
         </w:tc>
@@ -14656,14 +12942,12 @@
         </w:rPr>
         <w:t xml:space="preserve">: Выполнение </w:t>
       </w:r>
-      <w:proofErr w:type="spellStart"/>
       <w:r>
         <w:rPr>
           <w:rFonts w:cs="Times New Roman"/>
         </w:rPr>
         <w:t>sql</w:t>
       </w:r>
-      <w:proofErr w:type="spellEnd"/>
       <w:r>
         <w:rPr>
           <w:rFonts w:cs="Times New Roman"/>
@@ -14694,14 +12978,12 @@
         </w:rPr>
         <w:t xml:space="preserve">Результат выполнения </w:t>
       </w:r>
-      <w:proofErr w:type="spellStart"/>
       <w:r>
         <w:rPr>
           <w:rFonts w:cs="Times New Roman"/>
         </w:rPr>
         <w:t>sql</w:t>
       </w:r>
-      <w:proofErr w:type="spellEnd"/>
       <w:r>
         <w:rPr>
           <w:rFonts w:cs="Times New Roman"/>
@@ -14736,6 +13018,7 @@
       <w:r>
         <w:rPr>
           <w:rFonts w:cs="Times New Roman"/>
+          <w:noProof/>
           <w:lang w:val="ru-RU"/>
         </w:rPr>
         <w:drawing>
@@ -14812,14 +13095,12 @@
         </w:rPr>
         <w:t xml:space="preserve">: Выполнение </w:t>
       </w:r>
-      <w:proofErr w:type="spellStart"/>
       <w:r>
         <w:rPr>
           <w:rFonts w:cs="Times New Roman"/>
         </w:rPr>
         <w:t>sql</w:t>
       </w:r>
-      <w:proofErr w:type="spellEnd"/>
       <w:r>
         <w:rPr>
           <w:rFonts w:cs="Times New Roman"/>
@@ -14964,32 +13245,14 @@
         </w:rPr>
       </w:pPr>
       <w:bookmarkStart w:id="16" w:name="_Toc240884233"/>
-      <w:proofErr w:type="spellStart"/>
       <w:r>
         <w:rPr>
           <w:rFonts w:ascii="Times New Roman" w:hAnsi="Times New Roman"/>
           <w:szCs w:val="28"/>
         </w:rPr>
         <w:lastRenderedPageBreak/>
-        <w:t>Включите</w:t>
-      </w:r>
-      <w:proofErr w:type="spellEnd"/>
-      <w:r>
-        <w:rPr>
-          <w:rFonts w:ascii="Times New Roman" w:hAnsi="Times New Roman"/>
-          <w:szCs w:val="28"/>
-        </w:rPr>
-        <w:t xml:space="preserve"> </w:t>
-      </w:r>
-      <w:proofErr w:type="spellStart"/>
-      <w:r>
-        <w:rPr>
-          <w:rFonts w:ascii="Times New Roman" w:hAnsi="Times New Roman"/>
-          <w:szCs w:val="28"/>
-        </w:rPr>
-        <w:t>архивирование</w:t>
-      </w:r>
-      <w:proofErr w:type="spellEnd"/>
+        <w:t>Включите архивирование</w:t>
+      </w:r>
       <w:r>
         <w:rPr>
           <w:rFonts w:ascii="Times New Roman" w:hAnsi="Times New Roman"/>
@@ -15080,54 +13343,8 @@
                 <w:sz w:val="24"/>
                 <w:szCs w:val="24"/>
               </w:rPr>
-              <w:t xml:space="preserve">docker exec -it </w:t>
+              <w:t>docker exec -it aar-oracle sqlplus / as sysdba</w:t>
             </w:r>
-            <w:proofErr w:type="spellStart"/>
-            <w:r>
-              <w:rPr>
-                <w:rFonts w:ascii="Courier New" w:hAnsi="Courier New" w:cs="Courier New"/>
-                <w:sz w:val="24"/>
-                <w:szCs w:val="24"/>
-              </w:rPr>
-              <w:t>aar</w:t>
-            </w:r>
-            <w:proofErr w:type="spellEnd"/>
-            <w:r>
-              <w:rPr>
-                <w:rFonts w:ascii="Courier New" w:hAnsi="Courier New" w:cs="Courier New"/>
-                <w:sz w:val="24"/>
-                <w:szCs w:val="24"/>
-              </w:rPr>
-              <w:t xml:space="preserve">-oracle </w:t>
-            </w:r>
-            <w:proofErr w:type="spellStart"/>
-            <w:r>
-              <w:rPr>
-                <w:rFonts w:ascii="Courier New" w:hAnsi="Courier New" w:cs="Courier New"/>
-                <w:sz w:val="24"/>
-                <w:szCs w:val="24"/>
-              </w:rPr>
-              <w:t>sqlplus</w:t>
-            </w:r>
-            <w:proofErr w:type="spellEnd"/>
-            <w:r>
-              <w:rPr>
-                <w:rFonts w:ascii="Courier New" w:hAnsi="Courier New" w:cs="Courier New"/>
-                <w:sz w:val="24"/>
-                <w:szCs w:val="24"/>
-              </w:rPr>
-              <w:t xml:space="preserve"> / as </w:t>
-            </w:r>
-            <w:proofErr w:type="spellStart"/>
-            <w:r>
-              <w:rPr>
-                <w:rFonts w:ascii="Courier New" w:hAnsi="Courier New" w:cs="Courier New"/>
-                <w:sz w:val="24"/>
-                <w:szCs w:val="24"/>
-              </w:rPr>
-              <w:t>sysdba</w:t>
-            </w:r>
-            <w:proofErr w:type="spellEnd"/>
           </w:p>
           <w:p>
             <w:pPr>
@@ -15214,43 +13431,7 @@
                 <w:sz w:val="24"/>
                 <w:szCs w:val="24"/>
               </w:rPr>
-              <w:t xml:space="preserve">SELECT </w:t>
-            </w:r>
-            <w:proofErr w:type="spellStart"/>
-            <w:r>
-              <w:rPr>
-                <w:rFonts w:ascii="Courier New" w:hAnsi="Courier New" w:cs="Courier New"/>
-                <w:sz w:val="24"/>
-                <w:szCs w:val="24"/>
-              </w:rPr>
-              <w:t>log_mode</w:t>
-            </w:r>
-            <w:proofErr w:type="spellEnd"/>
-            <w:r>
-              <w:rPr>
-                <w:rFonts w:ascii="Courier New" w:hAnsi="Courier New" w:cs="Courier New"/>
-                <w:sz w:val="24"/>
-                <w:szCs w:val="24"/>
-              </w:rPr>
-              <w:t xml:space="preserve"> FROM </w:t>
-            </w:r>
-            <w:proofErr w:type="spellStart"/>
-            <w:r>
-              <w:rPr>
-                <w:rFonts w:ascii="Courier New" w:hAnsi="Courier New" w:cs="Courier New"/>
-                <w:sz w:val="24"/>
-                <w:szCs w:val="24"/>
-              </w:rPr>
-              <w:t>v$database</w:t>
-            </w:r>
-            <w:proofErr w:type="spellEnd"/>
-            <w:r>
-              <w:rPr>
-                <w:rFonts w:ascii="Courier New" w:hAnsi="Courier New" w:cs="Courier New"/>
-                <w:sz w:val="24"/>
-                <w:szCs w:val="24"/>
-              </w:rPr>
-              <w:t>;</w:t>
+              <w:t>SELECT log_mode FROM v$database;</w:t>
             </w:r>
           </w:p>
         </w:tc>
@@ -15372,6 +13553,7 @@
       <w:r>
         <w:rPr>
           <w:rFonts w:cs="Times New Roman"/>
+          <w:noProof/>
           <w:lang w:val="ru-RU"/>
         </w:rPr>
         <w:drawing>
@@ -15601,85 +13783,12 @@
         <w:lastRenderedPageBreak/>
         <w:t xml:space="preserve">Принудительно создайте архивный файл. Определите его номер. Определите его местоположение и убедитесь в его наличии. </w:t>
       </w:r>
-      <w:proofErr w:type="spellStart"/>
       <w:r>
         <w:rPr>
           <w:rFonts w:ascii="Times New Roman" w:hAnsi="Times New Roman"/>
           <w:szCs w:val="28"/>
         </w:rPr>
-        <w:t>Проследите</w:t>
-      </w:r>
-      <w:proofErr w:type="spellEnd"/>
-      <w:r>
-        <w:rPr>
-          <w:rFonts w:ascii="Times New Roman" w:hAnsi="Times New Roman"/>
-          <w:szCs w:val="28"/>
-        </w:rPr>
-        <w:t xml:space="preserve"> </w:t>
-      </w:r>
-      <w:proofErr w:type="spellStart"/>
-      <w:r>
-        <w:rPr>
-          <w:rFonts w:ascii="Times New Roman" w:hAnsi="Times New Roman"/>
-          <w:szCs w:val="28"/>
-        </w:rPr>
-        <w:t>последовательность</w:t>
-      </w:r>
-      <w:proofErr w:type="spellEnd"/>
-      <w:r>
-        <w:rPr>
-          <w:rFonts w:ascii="Times New Roman" w:hAnsi="Times New Roman"/>
-          <w:szCs w:val="28"/>
-        </w:rPr>
-        <w:t xml:space="preserve"> SCN в </w:t>
-      </w:r>
-      <w:proofErr w:type="spellStart"/>
-      <w:r>
-        <w:rPr>
-          <w:rFonts w:ascii="Times New Roman" w:hAnsi="Times New Roman"/>
-          <w:szCs w:val="28"/>
-        </w:rPr>
-        <w:t>архивах</w:t>
-      </w:r>
-      <w:proofErr w:type="spellEnd"/>
-      <w:r>
-        <w:rPr>
-          <w:rFonts w:ascii="Times New Roman" w:hAnsi="Times New Roman"/>
-          <w:szCs w:val="28"/>
-        </w:rPr>
-        <w:t xml:space="preserve"> и </w:t>
-      </w:r>
-      <w:proofErr w:type="spellStart"/>
-      <w:r>
-        <w:rPr>
-          <w:rFonts w:ascii="Times New Roman" w:hAnsi="Times New Roman"/>
-          <w:szCs w:val="28"/>
-        </w:rPr>
-        <w:t>журналах</w:t>
-      </w:r>
-      <w:proofErr w:type="spellEnd"/>
-      <w:r>
-        <w:rPr>
-          <w:rFonts w:ascii="Times New Roman" w:hAnsi="Times New Roman"/>
-          <w:szCs w:val="28"/>
-        </w:rPr>
-        <w:t xml:space="preserve"> </w:t>
-      </w:r>
-      <w:proofErr w:type="spellStart"/>
-      <w:r>
-        <w:rPr>
-          <w:rFonts w:ascii="Times New Roman" w:hAnsi="Times New Roman"/>
-          <w:szCs w:val="28"/>
-        </w:rPr>
-        <w:t>повтора</w:t>
-      </w:r>
-      <w:proofErr w:type="spellEnd"/>
-      <w:r>
-        <w:rPr>
-          <w:rFonts w:ascii="Times New Roman" w:hAnsi="Times New Roman"/>
-          <w:szCs w:val="28"/>
-        </w:rPr>
-        <w:t>.</w:t>
+        <w:t>Проследите последовательность SCN в архивах и журналах повтора.</w:t>
       </w:r>
       <w:bookmarkEnd w:id="17"/>
     </w:p>
@@ -15784,43 +13893,7 @@
                 <w:sz w:val="24"/>
                 <w:szCs w:val="24"/>
               </w:rPr>
-              <w:t xml:space="preserve">SELECT sequence#, name, </w:t>
-            </w:r>
-            <w:proofErr w:type="spellStart"/>
-            <w:r>
-              <w:rPr>
-                <w:rFonts w:ascii="Courier New" w:hAnsi="Courier New" w:cs="Courier New"/>
-                <w:sz w:val="24"/>
-                <w:szCs w:val="24"/>
-              </w:rPr>
-              <w:t>first_change</w:t>
-            </w:r>
-            <w:proofErr w:type="spellEnd"/>
-            <w:r>
-              <w:rPr>
-                <w:rFonts w:ascii="Courier New" w:hAnsi="Courier New" w:cs="Courier New"/>
-                <w:sz w:val="24"/>
-                <w:szCs w:val="24"/>
-              </w:rPr>
-              <w:t xml:space="preserve">#, </w:t>
-            </w:r>
-            <w:proofErr w:type="spellStart"/>
-            <w:r>
-              <w:rPr>
-                <w:rFonts w:ascii="Courier New" w:hAnsi="Courier New" w:cs="Courier New"/>
-                <w:sz w:val="24"/>
-                <w:szCs w:val="24"/>
-              </w:rPr>
-              <w:t>next_change</w:t>
-            </w:r>
-            <w:proofErr w:type="spellEnd"/>
-            <w:r>
-              <w:rPr>
-                <w:rFonts w:ascii="Courier New" w:hAnsi="Courier New" w:cs="Courier New"/>
-                <w:sz w:val="24"/>
-                <w:szCs w:val="24"/>
-              </w:rPr>
-              <w:t xml:space="preserve"># </w:t>
+              <w:t xml:space="preserve">SELECT sequence#, name, first_change#, next_change# </w:t>
             </w:r>
           </w:p>
           <w:p>
@@ -15838,25 +13911,7 @@
                 <w:sz w:val="24"/>
                 <w:szCs w:val="24"/>
               </w:rPr>
-              <w:t xml:space="preserve">    FROM </w:t>
-            </w:r>
-            <w:proofErr w:type="spellStart"/>
-            <w:r>
-              <w:rPr>
-                <w:rFonts w:ascii="Courier New" w:hAnsi="Courier New" w:cs="Courier New"/>
-                <w:sz w:val="24"/>
-                <w:szCs w:val="24"/>
-              </w:rPr>
-              <w:t>v$archived_log</w:t>
-            </w:r>
-            <w:proofErr w:type="spellEnd"/>
-            <w:r>
-              <w:rPr>
-                <w:rFonts w:ascii="Courier New" w:hAnsi="Courier New" w:cs="Courier New"/>
-                <w:sz w:val="24"/>
-                <w:szCs w:val="24"/>
-              </w:rPr>
-              <w:t>;</w:t>
+              <w:t xml:space="preserve">    FROM v$archived_log;</w:t>
             </w:r>
           </w:p>
           <w:p>
@@ -15884,43 +13939,7 @@
                 <w:sz w:val="24"/>
                 <w:szCs w:val="24"/>
               </w:rPr>
-              <w:t xml:space="preserve">SELECT sequence#, status, </w:t>
-            </w:r>
-            <w:proofErr w:type="spellStart"/>
-            <w:r>
-              <w:rPr>
-                <w:rFonts w:ascii="Courier New" w:hAnsi="Courier New" w:cs="Courier New"/>
-                <w:sz w:val="24"/>
-                <w:szCs w:val="24"/>
-              </w:rPr>
-              <w:t>first_change</w:t>
-            </w:r>
-            <w:proofErr w:type="spellEnd"/>
-            <w:r>
-              <w:rPr>
-                <w:rFonts w:ascii="Courier New" w:hAnsi="Courier New" w:cs="Courier New"/>
-                <w:sz w:val="24"/>
-                <w:szCs w:val="24"/>
-              </w:rPr>
-              <w:t xml:space="preserve">#, </w:t>
-            </w:r>
-            <w:proofErr w:type="spellStart"/>
-            <w:r>
-              <w:rPr>
-                <w:rFonts w:ascii="Courier New" w:hAnsi="Courier New" w:cs="Courier New"/>
-                <w:sz w:val="24"/>
-                <w:szCs w:val="24"/>
-              </w:rPr>
-              <w:t>next_change</w:t>
-            </w:r>
-            <w:proofErr w:type="spellEnd"/>
-            <w:r>
-              <w:rPr>
-                <w:rFonts w:ascii="Courier New" w:hAnsi="Courier New" w:cs="Courier New"/>
-                <w:sz w:val="24"/>
-                <w:szCs w:val="24"/>
-              </w:rPr>
-              <w:t xml:space="preserve"># </w:t>
+              <w:t xml:space="preserve">SELECT sequence#, status, first_change#, next_change# </w:t>
             </w:r>
           </w:p>
           <w:p>
@@ -15938,25 +13957,7 @@
                 <w:sz w:val="24"/>
                 <w:szCs w:val="24"/>
               </w:rPr>
-              <w:t xml:space="preserve">    FROM </w:t>
-            </w:r>
-            <w:proofErr w:type="spellStart"/>
-            <w:r>
-              <w:rPr>
-                <w:rFonts w:ascii="Courier New" w:hAnsi="Courier New" w:cs="Courier New"/>
-                <w:sz w:val="24"/>
-                <w:szCs w:val="24"/>
-              </w:rPr>
-              <w:t>v$log</w:t>
-            </w:r>
-            <w:proofErr w:type="spellEnd"/>
-            <w:r>
-              <w:rPr>
-                <w:rFonts w:ascii="Courier New" w:hAnsi="Courier New" w:cs="Courier New"/>
-                <w:sz w:val="24"/>
-                <w:szCs w:val="24"/>
-              </w:rPr>
-              <w:t>;</w:t>
+              <w:t xml:space="preserve">    FROM v$log;</w:t>
             </w:r>
           </w:p>
         </w:tc>
@@ -16064,6 +14065,7 @@
       <w:r>
         <w:rPr>
           <w:rFonts w:cs="Times New Roman"/>
+          <w:noProof/>
           <w:lang w:val="ru-RU"/>
         </w:rPr>
         <w:drawing>
@@ -16172,47 +14174,7 @@
           <w:szCs w:val="28"/>
           <w:lang w:val="ru-RU" w:eastAsia="ru-RU"/>
         </w:rPr>
-        <w:t xml:space="preserve">Для принудительного создания архивного файла было инициировано переключение журналов повтора. С помощью запросов к представлениям </w:t>
-      </w:r>
-      <w:proofErr w:type="spellStart"/>
-      <w:r>
-        <w:rPr>
-          <w:rFonts w:cs="Times New Roman"/>
-          <w:color w:val="auto"/>
-          <w:szCs w:val="28"/>
-          <w:lang w:val="ru-RU" w:eastAsia="ru-RU"/>
-        </w:rPr>
-        <w:t>v$archived_log</w:t>
-      </w:r>
-      <w:proofErr w:type="spellEnd"/>
-      <w:r>
-        <w:rPr>
-          <w:rFonts w:cs="Times New Roman"/>
-          <w:color w:val="auto"/>
-          <w:szCs w:val="28"/>
-          <w:lang w:val="ru-RU" w:eastAsia="ru-RU"/>
-        </w:rPr>
-        <w:t xml:space="preserve"> и </w:t>
-      </w:r>
-      <w:proofErr w:type="spellStart"/>
-      <w:r>
-        <w:rPr>
-          <w:rFonts w:cs="Times New Roman"/>
-          <w:color w:val="auto"/>
-          <w:szCs w:val="28"/>
-          <w:lang w:val="ru-RU" w:eastAsia="ru-RU"/>
-        </w:rPr>
-        <w:t>v$log</w:t>
-      </w:r>
-      <w:proofErr w:type="spellEnd"/>
-      <w:r>
-        <w:rPr>
-          <w:rFonts w:cs="Times New Roman"/>
-          <w:color w:val="auto"/>
-          <w:szCs w:val="28"/>
-          <w:lang w:val="ru-RU" w:eastAsia="ru-RU"/>
-        </w:rPr>
-        <w:t xml:space="preserve"> были определены номер созданного архива и его директория, а также прослежена непрерывная последовательность системных номеров изменений (SCN) между заархивированными и активными журналами. Фактическое наличие созданного архивного файла на сервере успешно подтверждено через командную строку контейнера.</w:t>
+        <w:t>Для принудительного создания архивного файла было инициировано переключение журналов повтора. С помощью запросов к представлениям v$archived_log и v$log были определены номер созданного архива и его директория, а также прослежена непрерывная последовательность системных номеров изменений (SCN) между заархивированными и активными журналами. Фактическое наличие созданного архивного файла на сервере успешно подтверждено через командную строку контейнера.</w:t>
       </w:r>
     </w:p>
     <w:p>
@@ -16347,54 +14309,8 @@
                 <w:sz w:val="24"/>
                 <w:szCs w:val="24"/>
               </w:rPr>
-              <w:t xml:space="preserve">docker exec -it </w:t>
+              <w:t>docker exec -it aar-oracle sqlplus / as sysdba</w:t>
             </w:r>
-            <w:proofErr w:type="spellStart"/>
-            <w:r>
-              <w:rPr>
-                <w:rFonts w:ascii="Courier New" w:hAnsi="Courier New" w:cs="Courier New"/>
-                <w:sz w:val="24"/>
-                <w:szCs w:val="24"/>
-              </w:rPr>
-              <w:t>aar</w:t>
-            </w:r>
-            <w:proofErr w:type="spellEnd"/>
-            <w:r>
-              <w:rPr>
-                <w:rFonts w:ascii="Courier New" w:hAnsi="Courier New" w:cs="Courier New"/>
-                <w:sz w:val="24"/>
-                <w:szCs w:val="24"/>
-              </w:rPr>
-              <w:t xml:space="preserve">-oracle </w:t>
-            </w:r>
-            <w:proofErr w:type="spellStart"/>
-            <w:r>
-              <w:rPr>
-                <w:rFonts w:ascii="Courier New" w:hAnsi="Courier New" w:cs="Courier New"/>
-                <w:sz w:val="24"/>
-                <w:szCs w:val="24"/>
-              </w:rPr>
-              <w:t>sqlplus</w:t>
-            </w:r>
-            <w:proofErr w:type="spellEnd"/>
-            <w:r>
-              <w:rPr>
-                <w:rFonts w:ascii="Courier New" w:hAnsi="Courier New" w:cs="Courier New"/>
-                <w:sz w:val="24"/>
-                <w:szCs w:val="24"/>
-              </w:rPr>
-              <w:t xml:space="preserve"> / as </w:t>
-            </w:r>
-            <w:proofErr w:type="spellStart"/>
-            <w:r>
-              <w:rPr>
-                <w:rFonts w:ascii="Courier New" w:hAnsi="Courier New" w:cs="Courier New"/>
-                <w:sz w:val="24"/>
-                <w:szCs w:val="24"/>
-              </w:rPr>
-              <w:t>sysdba</w:t>
-            </w:r>
-            <w:proofErr w:type="spellEnd"/>
           </w:p>
           <w:p>
             <w:pPr>
@@ -16483,43 +14399,7 @@
                 <w:sz w:val="24"/>
                 <w:szCs w:val="24"/>
               </w:rPr>
-              <w:t xml:space="preserve">SELECT </w:t>
-            </w:r>
-            <w:proofErr w:type="spellStart"/>
-            <w:r>
-              <w:rPr>
-                <w:rFonts w:ascii="Courier New" w:hAnsi="Courier New" w:cs="Courier New"/>
-                <w:sz w:val="24"/>
-                <w:szCs w:val="24"/>
-              </w:rPr>
-              <w:t>log_mode</w:t>
-            </w:r>
-            <w:proofErr w:type="spellEnd"/>
-            <w:r>
-              <w:rPr>
-                <w:rFonts w:ascii="Courier New" w:hAnsi="Courier New" w:cs="Courier New"/>
-                <w:sz w:val="24"/>
-                <w:szCs w:val="24"/>
-              </w:rPr>
-              <w:t xml:space="preserve"> FROM </w:t>
-            </w:r>
-            <w:proofErr w:type="spellStart"/>
-            <w:r>
-              <w:rPr>
-                <w:rFonts w:ascii="Courier New" w:hAnsi="Courier New" w:cs="Courier New"/>
-                <w:sz w:val="24"/>
-                <w:szCs w:val="24"/>
-              </w:rPr>
-              <w:t>v$database</w:t>
-            </w:r>
-            <w:proofErr w:type="spellEnd"/>
-            <w:r>
-              <w:rPr>
-                <w:rFonts w:ascii="Courier New" w:hAnsi="Courier New" w:cs="Courier New"/>
-                <w:sz w:val="24"/>
-                <w:szCs w:val="24"/>
-              </w:rPr>
-              <w:t>;</w:t>
+              <w:t>SELECT log_mode FROM v$database;</w:t>
             </w:r>
           </w:p>
         </w:tc>
@@ -16627,6 +14507,7 @@
       <w:r>
         <w:rPr>
           <w:rFonts w:cs="Times New Roman"/>
+          <w:noProof/>
           <w:lang w:val="ru-RU"/>
         </w:rPr>
         <w:drawing>
@@ -16842,64 +14723,14 @@
         </w:rPr>
       </w:pPr>
       <w:bookmarkStart w:id="19" w:name="_Toc240884236"/>
-      <w:proofErr w:type="spellStart"/>
       <w:r>
         <w:rPr>
           <w:rFonts w:ascii="Times New Roman" w:hAnsi="Times New Roman"/>
           <w:szCs w:val="28"/>
         </w:rPr>
         <w:lastRenderedPageBreak/>
-        <w:t>Получите</w:t>
-      </w:r>
-      <w:proofErr w:type="spellEnd"/>
-      <w:r>
-        <w:rPr>
-          <w:rFonts w:ascii="Times New Roman" w:hAnsi="Times New Roman"/>
-          <w:szCs w:val="28"/>
-        </w:rPr>
-        <w:t xml:space="preserve"> </w:t>
-      </w:r>
-      <w:proofErr w:type="spellStart"/>
-      <w:r>
-        <w:rPr>
-          <w:rFonts w:ascii="Times New Roman" w:hAnsi="Times New Roman"/>
-          <w:szCs w:val="28"/>
-        </w:rPr>
-        <w:t>список</w:t>
-      </w:r>
-      <w:proofErr w:type="spellEnd"/>
-      <w:r>
-        <w:rPr>
-          <w:rFonts w:ascii="Times New Roman" w:hAnsi="Times New Roman"/>
-          <w:szCs w:val="28"/>
-        </w:rPr>
-        <w:t xml:space="preserve"> </w:t>
-      </w:r>
-      <w:proofErr w:type="spellStart"/>
-      <w:r>
-        <w:rPr>
-          <w:rFonts w:ascii="Times New Roman" w:hAnsi="Times New Roman"/>
-          <w:szCs w:val="28"/>
-        </w:rPr>
-        <w:t>управляющих</w:t>
-      </w:r>
-      <w:proofErr w:type="spellEnd"/>
-      <w:r>
-        <w:rPr>
-          <w:rFonts w:ascii="Times New Roman" w:hAnsi="Times New Roman"/>
-          <w:szCs w:val="28"/>
-        </w:rPr>
-        <w:t xml:space="preserve"> </w:t>
-      </w:r>
-      <w:proofErr w:type="spellStart"/>
-      <w:r>
-        <w:rPr>
-          <w:rFonts w:ascii="Times New Roman" w:hAnsi="Times New Roman"/>
-          <w:szCs w:val="28"/>
-        </w:rPr>
-        <w:t>файлов</w:t>
-      </w:r>
-      <w:proofErr w:type="spellEnd"/>
+        <w:t>Получите список управляющих файлов</w:t>
+      </w:r>
       <w:r>
         <w:rPr>
           <w:rFonts w:ascii="Times New Roman" w:hAnsi="Times New Roman"/>
@@ -17009,25 +14840,7 @@
                 <w:sz w:val="24"/>
                 <w:szCs w:val="24"/>
               </w:rPr>
-              <w:t xml:space="preserve">    FROM </w:t>
-            </w:r>
-            <w:proofErr w:type="spellStart"/>
-            <w:r>
-              <w:rPr>
-                <w:rFonts w:ascii="Courier New" w:hAnsi="Courier New" w:cs="Courier New"/>
-                <w:sz w:val="24"/>
-                <w:szCs w:val="24"/>
-              </w:rPr>
-              <w:t>v$controlfile</w:t>
-            </w:r>
-            <w:proofErr w:type="spellEnd"/>
-            <w:r>
-              <w:rPr>
-                <w:rFonts w:ascii="Courier New" w:hAnsi="Courier New" w:cs="Courier New"/>
-                <w:sz w:val="24"/>
-                <w:szCs w:val="24"/>
-              </w:rPr>
-              <w:t>;</w:t>
+              <w:t xml:space="preserve">    FROM v$controlfile;</w:t>
             </w:r>
           </w:p>
         </w:tc>
@@ -17142,6 +14955,7 @@
       <w:r>
         <w:rPr>
           <w:rFonts w:cs="Times New Roman"/>
+          <w:noProof/>
           <w:lang w:val="ru-RU"/>
         </w:rPr>
         <w:drawing>
@@ -17285,7 +15099,6 @@
         </w:rPr>
         <w:t>$</w:t>
       </w:r>
-      <w:proofErr w:type="spellStart"/>
       <w:r>
         <w:rPr>
           <w:rStyle w:val="HTML"/>
@@ -17295,7 +15108,6 @@
         </w:rPr>
         <w:t>controlfile</w:t>
       </w:r>
-      <w:proofErr w:type="spellEnd"/>
       <w:r>
         <w:rPr>
           <w:rFonts w:cs="Times New Roman"/>
@@ -17489,43 +15301,7 @@
                 <w:sz w:val="24"/>
                 <w:szCs w:val="24"/>
               </w:rPr>
-              <w:t xml:space="preserve">SELECT value AS </w:t>
-            </w:r>
-            <w:proofErr w:type="spellStart"/>
-            <w:r>
-              <w:rPr>
-                <w:rFonts w:ascii="Courier New" w:hAnsi="Courier New" w:cs="Courier New"/>
-                <w:sz w:val="24"/>
-                <w:szCs w:val="24"/>
-              </w:rPr>
-              <w:t>trace_file_path</w:t>
-            </w:r>
-            <w:proofErr w:type="spellEnd"/>
-            <w:r>
-              <w:rPr>
-                <w:rFonts w:ascii="Courier New" w:hAnsi="Courier New" w:cs="Courier New"/>
-                <w:sz w:val="24"/>
-                <w:szCs w:val="24"/>
-              </w:rPr>
-              <w:t xml:space="preserve"> FROM </w:t>
-            </w:r>
-            <w:proofErr w:type="spellStart"/>
-            <w:r>
-              <w:rPr>
-                <w:rFonts w:ascii="Courier New" w:hAnsi="Courier New" w:cs="Courier New"/>
-                <w:sz w:val="24"/>
-                <w:szCs w:val="24"/>
-              </w:rPr>
-              <w:t>v$diag_info</w:t>
-            </w:r>
-            <w:proofErr w:type="spellEnd"/>
-            <w:r>
-              <w:rPr>
-                <w:rFonts w:ascii="Courier New" w:hAnsi="Courier New" w:cs="Courier New"/>
-                <w:sz w:val="24"/>
-                <w:szCs w:val="24"/>
-              </w:rPr>
-              <w:t xml:space="preserve"> WHERE name = 'Default Trace File';</w:t>
+              <w:t>SELECT value AS trace_file_path FROM v$diag_info WHERE name = 'Default Trace File';</w:t>
             </w:r>
           </w:p>
           <w:p>
@@ -17543,61 +15319,7 @@
                 <w:sz w:val="24"/>
                 <w:szCs w:val="24"/>
               </w:rPr>
-              <w:t xml:space="preserve">docker exec -it </w:t>
-            </w:r>
-            <w:proofErr w:type="spellStart"/>
-            <w:r>
-              <w:rPr>
-                <w:rFonts w:ascii="Courier New" w:hAnsi="Courier New" w:cs="Courier New"/>
-                <w:sz w:val="24"/>
-                <w:szCs w:val="24"/>
-              </w:rPr>
-              <w:t>aar</w:t>
-            </w:r>
-            <w:proofErr w:type="spellEnd"/>
-            <w:r>
-              <w:rPr>
-                <w:rFonts w:ascii="Courier New" w:hAnsi="Courier New" w:cs="Courier New"/>
-                <w:sz w:val="24"/>
-                <w:szCs w:val="24"/>
-              </w:rPr>
-              <w:t>-oracle head -n 70 /opt/oracle/</w:t>
-            </w:r>
-            <w:proofErr w:type="spellStart"/>
-            <w:r>
-              <w:rPr>
-                <w:rFonts w:ascii="Courier New" w:hAnsi="Courier New" w:cs="Courier New"/>
-                <w:sz w:val="24"/>
-                <w:szCs w:val="24"/>
-              </w:rPr>
-              <w:t>diag</w:t>
-            </w:r>
-            <w:proofErr w:type="spellEnd"/>
-            <w:r>
-              <w:rPr>
-                <w:rFonts w:ascii="Courier New" w:hAnsi="Courier New" w:cs="Courier New"/>
-                <w:sz w:val="24"/>
-                <w:szCs w:val="24"/>
-              </w:rPr>
-              <w:t>/</w:t>
-            </w:r>
-            <w:proofErr w:type="spellStart"/>
-            <w:r>
-              <w:rPr>
-                <w:rFonts w:ascii="Courier New" w:hAnsi="Courier New" w:cs="Courier New"/>
-                <w:sz w:val="24"/>
-                <w:szCs w:val="24"/>
-              </w:rPr>
-              <w:t>rdbms</w:t>
-            </w:r>
-            <w:proofErr w:type="spellEnd"/>
-            <w:r>
-              <w:rPr>
-                <w:rFonts w:ascii="Courier New" w:hAnsi="Courier New" w:cs="Courier New"/>
-                <w:sz w:val="24"/>
-                <w:szCs w:val="24"/>
-              </w:rPr>
-              <w:t>/free/FREE/trace/FREE_ora_1234.trc</w:t>
+              <w:t>docker exec -it aar-oracle head -n 70 /opt/oracle/diag/rdbms/free/FREE/trace/FREE_ora_1234.trc</w:t>
             </w:r>
           </w:p>
         </w:tc>
@@ -17733,6 +15455,7 @@
       <w:r>
         <w:rPr>
           <w:rFonts w:cs="Times New Roman"/>
+          <w:noProof/>
           <w:lang w:val="ru-RU"/>
         </w:rPr>
         <w:drawing>
@@ -17837,6 +15560,7 @@
       <w:r>
         <w:rPr>
           <w:rFonts w:cs="Times New Roman"/>
+          <w:noProof/>
           <w:lang w:val="ru-RU"/>
         </w:rPr>
         <w:lastRenderedPageBreak/>
@@ -18244,25 +15968,7 @@
                 <w:sz w:val="24"/>
                 <w:szCs w:val="24"/>
               </w:rPr>
-              <w:t xml:space="preserve">FROM </w:t>
-            </w:r>
-            <w:proofErr w:type="spellStart"/>
-            <w:r>
-              <w:rPr>
-                <w:rFonts w:ascii="Courier New" w:hAnsi="Courier New" w:cs="Courier New"/>
-                <w:sz w:val="24"/>
-                <w:szCs w:val="24"/>
-              </w:rPr>
-              <w:t>v$parameter</w:t>
-            </w:r>
-            <w:proofErr w:type="spellEnd"/>
-            <w:r>
-              <w:rPr>
-                <w:rFonts w:ascii="Courier New" w:hAnsi="Courier New" w:cs="Courier New"/>
-                <w:sz w:val="24"/>
-                <w:szCs w:val="24"/>
-              </w:rPr>
-              <w:t xml:space="preserve"> </w:t>
+              <w:t xml:space="preserve">FROM v$parameter </w:t>
             </w:r>
           </w:p>
           <w:p>
@@ -18280,25 +15986,7 @@
                 <w:sz w:val="24"/>
                 <w:szCs w:val="24"/>
               </w:rPr>
-              <w:t>WHERE name = '</w:t>
-            </w:r>
-            <w:proofErr w:type="spellStart"/>
-            <w:r>
-              <w:rPr>
-                <w:rFonts w:ascii="Courier New" w:hAnsi="Courier New" w:cs="Courier New"/>
-                <w:sz w:val="24"/>
-                <w:szCs w:val="24"/>
-              </w:rPr>
-              <w:t>spfile</w:t>
-            </w:r>
-            <w:proofErr w:type="spellEnd"/>
-            <w:r>
-              <w:rPr>
-                <w:rFonts w:ascii="Courier New" w:hAnsi="Courier New" w:cs="Courier New"/>
-                <w:sz w:val="24"/>
-                <w:szCs w:val="24"/>
-              </w:rPr>
-              <w:t>';</w:t>
+              <w:t>WHERE name = 'spfile';</w:t>
             </w:r>
           </w:p>
           <w:p>
@@ -18326,48 +16014,17 @@
               </w:rPr>
               <w:t xml:space="preserve"> </w:t>
             </w:r>
-            <w:proofErr w:type="spellStart"/>
             <w:r>
               <w:rPr>
                 <w:rFonts w:ascii="Courier New" w:hAnsi="Courier New" w:cs="Courier New"/>
                 <w:sz w:val="24"/>
                 <w:szCs w:val="24"/>
               </w:rPr>
-              <w:t>aar</w:t>
-            </w:r>
-            <w:proofErr w:type="spellEnd"/>
-            <w:r>
-              <w:rPr>
-                <w:rFonts w:ascii="Courier New" w:hAnsi="Courier New" w:cs="Courier New"/>
-                <w:sz w:val="24"/>
-                <w:szCs w:val="24"/>
-              </w:rPr>
-              <w:t xml:space="preserve">-oracle ls -l </w:t>
+              <w:t xml:space="preserve">aar-oracle ls -l </w:t>
             </w:r>
             <w:r>
-              <w:t>/opt/oracle/product/26ai/</w:t>
+              <w:t>/opt/oracle/product/26ai/dbhomeFree/dbs/spfileFREE.ora</w:t>
             </w:r>
-            <w:proofErr w:type="spellStart"/>
-            <w:r>
-              <w:t>dbhomeFree</w:t>
-            </w:r>
-            <w:proofErr w:type="spellEnd"/>
-            <w:r>
-              <w:t>/</w:t>
-            </w:r>
-            <w:proofErr w:type="spellStart"/>
-            <w:r>
-              <w:t>dbs</w:t>
-            </w:r>
-            <w:proofErr w:type="spellEnd"/>
-            <w:r>
-              <w:t>/</w:t>
-            </w:r>
-            <w:proofErr w:type="spellStart"/>
-            <w:r>
-              <w:t>spfileFREE.ora</w:t>
-            </w:r>
-            <w:proofErr w:type="spellEnd"/>
           </w:p>
         </w:tc>
       </w:tr>
@@ -18488,6 +16145,7 @@
       <w:r>
         <w:rPr>
           <w:rFonts w:cs="Times New Roman"/>
+          <w:noProof/>
           <w:lang w:val="ru-RU"/>
         </w:rPr>
         <w:drawing>
@@ -18757,85 +16415,12 @@
         </w:rPr>
         <w:t xml:space="preserve">. Исследуйте его содержимое. </w:t>
       </w:r>
-      <w:proofErr w:type="spellStart"/>
       <w:r>
         <w:rPr>
           <w:rFonts w:ascii="Times New Roman" w:hAnsi="Times New Roman"/>
           <w:szCs w:val="28"/>
         </w:rPr>
-        <w:t>Поясните</w:t>
-      </w:r>
-      <w:proofErr w:type="spellEnd"/>
-      <w:r>
-        <w:rPr>
-          <w:rFonts w:ascii="Times New Roman" w:hAnsi="Times New Roman"/>
-          <w:szCs w:val="28"/>
-        </w:rPr>
-        <w:t xml:space="preserve"> </w:t>
-      </w:r>
-      <w:proofErr w:type="spellStart"/>
-      <w:r>
-        <w:rPr>
-          <w:rFonts w:ascii="Times New Roman" w:hAnsi="Times New Roman"/>
-          <w:szCs w:val="28"/>
-        </w:rPr>
-        <w:t>известные</w:t>
-      </w:r>
-      <w:proofErr w:type="spellEnd"/>
-      <w:r>
-        <w:rPr>
-          <w:rFonts w:ascii="Times New Roman" w:hAnsi="Times New Roman"/>
-          <w:szCs w:val="28"/>
-        </w:rPr>
-        <w:t xml:space="preserve"> </w:t>
-      </w:r>
-      <w:proofErr w:type="spellStart"/>
-      <w:r>
-        <w:rPr>
-          <w:rFonts w:ascii="Times New Roman" w:hAnsi="Times New Roman"/>
-          <w:szCs w:val="28"/>
-        </w:rPr>
-        <w:t>вам</w:t>
-      </w:r>
-      <w:proofErr w:type="spellEnd"/>
-      <w:r>
-        <w:rPr>
-          <w:rFonts w:ascii="Times New Roman" w:hAnsi="Times New Roman"/>
-          <w:szCs w:val="28"/>
-        </w:rPr>
-        <w:t xml:space="preserve"> </w:t>
-      </w:r>
-      <w:proofErr w:type="spellStart"/>
-      <w:r>
-        <w:rPr>
-          <w:rFonts w:ascii="Times New Roman" w:hAnsi="Times New Roman"/>
-          <w:szCs w:val="28"/>
-        </w:rPr>
-        <w:t>параметры</w:t>
-      </w:r>
-      <w:proofErr w:type="spellEnd"/>
-      <w:r>
-        <w:rPr>
-          <w:rFonts w:ascii="Times New Roman" w:hAnsi="Times New Roman"/>
-          <w:szCs w:val="28"/>
-        </w:rPr>
-        <w:t xml:space="preserve"> в </w:t>
-      </w:r>
-      <w:proofErr w:type="spellStart"/>
-      <w:r>
-        <w:rPr>
-          <w:rFonts w:ascii="Times New Roman" w:hAnsi="Times New Roman"/>
-          <w:szCs w:val="28"/>
-        </w:rPr>
-        <w:t>файле</w:t>
-      </w:r>
-      <w:proofErr w:type="spellEnd"/>
-      <w:r>
-        <w:rPr>
-          <w:rFonts w:ascii="Times New Roman" w:hAnsi="Times New Roman"/>
-          <w:szCs w:val="28"/>
-        </w:rPr>
-        <w:t>.</w:t>
+        <w:t>Поясните известные вам параметры в файле.</w:t>
       </w:r>
       <w:bookmarkEnd w:id="22"/>
       <w:r>
@@ -18927,54 +16512,8 @@
                 <w:sz w:val="24"/>
                 <w:szCs w:val="24"/>
               </w:rPr>
-              <w:t xml:space="preserve">docker exec -it </w:t>
+              <w:t>docker exec -it aar-oracle sqlplus / as sysdba</w:t>
             </w:r>
-            <w:proofErr w:type="spellStart"/>
-            <w:r>
-              <w:rPr>
-                <w:rFonts w:ascii="Courier New" w:hAnsi="Courier New" w:cs="Courier New"/>
-                <w:sz w:val="24"/>
-                <w:szCs w:val="24"/>
-              </w:rPr>
-              <w:t>aar</w:t>
-            </w:r>
-            <w:proofErr w:type="spellEnd"/>
-            <w:r>
-              <w:rPr>
-                <w:rFonts w:ascii="Courier New" w:hAnsi="Courier New" w:cs="Courier New"/>
-                <w:sz w:val="24"/>
-                <w:szCs w:val="24"/>
-              </w:rPr>
-              <w:t xml:space="preserve">-oracle </w:t>
-            </w:r>
-            <w:proofErr w:type="spellStart"/>
-            <w:r>
-              <w:rPr>
-                <w:rFonts w:ascii="Courier New" w:hAnsi="Courier New" w:cs="Courier New"/>
-                <w:sz w:val="24"/>
-                <w:szCs w:val="24"/>
-              </w:rPr>
-              <w:t>sqlplus</w:t>
-            </w:r>
-            <w:proofErr w:type="spellEnd"/>
-            <w:r>
-              <w:rPr>
-                <w:rFonts w:ascii="Courier New" w:hAnsi="Courier New" w:cs="Courier New"/>
-                <w:sz w:val="24"/>
-                <w:szCs w:val="24"/>
-              </w:rPr>
-              <w:t xml:space="preserve"> / as </w:t>
-            </w:r>
-            <w:proofErr w:type="spellStart"/>
-            <w:r>
-              <w:rPr>
-                <w:rFonts w:ascii="Courier New" w:hAnsi="Courier New" w:cs="Courier New"/>
-                <w:sz w:val="24"/>
-                <w:szCs w:val="24"/>
-              </w:rPr>
-              <w:t>sysdba</w:t>
-            </w:r>
-            <w:proofErr w:type="spellEnd"/>
           </w:p>
           <w:p>
             <w:pPr>
@@ -18991,43 +16530,7 @@
                 <w:sz w:val="24"/>
                 <w:szCs w:val="24"/>
               </w:rPr>
-              <w:t>CREATE PFILE='/opt/oracle/product/26ai/</w:t>
-            </w:r>
-            <w:proofErr w:type="spellStart"/>
-            <w:r>
-              <w:rPr>
-                <w:rFonts w:ascii="Courier New" w:hAnsi="Courier New" w:cs="Courier New"/>
-                <w:sz w:val="24"/>
-                <w:szCs w:val="24"/>
-              </w:rPr>
-              <w:t>dbhomeFree</w:t>
-            </w:r>
-            <w:proofErr w:type="spellEnd"/>
-            <w:r>
-              <w:rPr>
-                <w:rFonts w:ascii="Courier New" w:hAnsi="Courier New" w:cs="Courier New"/>
-                <w:sz w:val="24"/>
-                <w:szCs w:val="24"/>
-              </w:rPr>
-              <w:t>/</w:t>
-            </w:r>
-            <w:proofErr w:type="spellStart"/>
-            <w:r>
-              <w:rPr>
-                <w:rFonts w:ascii="Courier New" w:hAnsi="Courier New" w:cs="Courier New"/>
-                <w:sz w:val="24"/>
-                <w:szCs w:val="24"/>
-              </w:rPr>
-              <w:t>dbs</w:t>
-            </w:r>
-            <w:proofErr w:type="spellEnd"/>
-            <w:r>
-              <w:rPr>
-                <w:rFonts w:ascii="Courier New" w:hAnsi="Courier New" w:cs="Courier New"/>
-                <w:sz w:val="24"/>
-                <w:szCs w:val="24"/>
-              </w:rPr>
-              <w:t>/</w:t>
+              <w:t>CREATE PFILE='/opt/oracle/product/26ai/dbhomeFree/dbs/</w:t>
             </w:r>
             <w:r>
               <w:rPr>
@@ -19061,61 +16564,7 @@
                 <w:sz w:val="24"/>
                 <w:szCs w:val="24"/>
               </w:rPr>
-              <w:t xml:space="preserve">docker exec -it </w:t>
-            </w:r>
-            <w:proofErr w:type="spellStart"/>
-            <w:r>
-              <w:rPr>
-                <w:rFonts w:ascii="Courier New" w:hAnsi="Courier New" w:cs="Courier New"/>
-                <w:sz w:val="24"/>
-                <w:szCs w:val="24"/>
-              </w:rPr>
-              <w:t>aar</w:t>
-            </w:r>
-            <w:proofErr w:type="spellEnd"/>
-            <w:r>
-              <w:rPr>
-                <w:rFonts w:ascii="Courier New" w:hAnsi="Courier New" w:cs="Courier New"/>
-                <w:sz w:val="24"/>
-                <w:szCs w:val="24"/>
-              </w:rPr>
-              <w:t>-oracle cat /opt/oracle/product/26ai/</w:t>
-            </w:r>
-            <w:proofErr w:type="spellStart"/>
-            <w:r>
-              <w:rPr>
-                <w:rFonts w:ascii="Courier New" w:hAnsi="Courier New" w:cs="Courier New"/>
-                <w:sz w:val="24"/>
-                <w:szCs w:val="24"/>
-              </w:rPr>
-              <w:t>dbhomeFree</w:t>
-            </w:r>
-            <w:proofErr w:type="spellEnd"/>
-            <w:r>
-              <w:rPr>
-                <w:rFonts w:ascii="Courier New" w:hAnsi="Courier New" w:cs="Courier New"/>
-                <w:sz w:val="24"/>
-                <w:szCs w:val="24"/>
-              </w:rPr>
-              <w:t>/</w:t>
-            </w:r>
-            <w:proofErr w:type="spellStart"/>
-            <w:r>
-              <w:rPr>
-                <w:rFonts w:ascii="Courier New" w:hAnsi="Courier New" w:cs="Courier New"/>
-                <w:sz w:val="24"/>
-                <w:szCs w:val="24"/>
-              </w:rPr>
-              <w:t>dbs</w:t>
-            </w:r>
-            <w:proofErr w:type="spellEnd"/>
-            <w:r>
-              <w:rPr>
-                <w:rFonts w:ascii="Courier New" w:hAnsi="Courier New" w:cs="Courier New"/>
-                <w:sz w:val="24"/>
-                <w:szCs w:val="24"/>
-              </w:rPr>
-              <w:t>/</w:t>
+              <w:t>docker exec -it aar-oracle cat /opt/oracle/product/26ai/dbhomeFree/dbs/</w:t>
             </w:r>
             <w:r>
               <w:rPr>
@@ -19253,6 +16702,7 @@
       <w:r>
         <w:rPr>
           <w:rFonts w:cs="Times New Roman"/>
+          <w:noProof/>
           <w:lang w:val="ru-RU"/>
         </w:rPr>
         <w:drawing>
@@ -19503,72 +16953,8 @@
                 <w:sz w:val="24"/>
                 <w:szCs w:val="24"/>
               </w:rPr>
-              <w:t xml:space="preserve">docker exec -it </w:t>
+              <w:t>docker exec -it aar-oracle ls -l /opt/oracle/product/26ai/dbhomeFree/dbs/orapwFREE</w:t>
             </w:r>
-            <w:proofErr w:type="spellStart"/>
-            <w:r>
-              <w:rPr>
-                <w:rFonts w:ascii="Courier New" w:hAnsi="Courier New" w:cs="Courier New"/>
-                <w:sz w:val="24"/>
-                <w:szCs w:val="24"/>
-              </w:rPr>
-              <w:t>aar</w:t>
-            </w:r>
-            <w:proofErr w:type="spellEnd"/>
-            <w:r>
-              <w:rPr>
-                <w:rFonts w:ascii="Courier New" w:hAnsi="Courier New" w:cs="Courier New"/>
-                <w:sz w:val="24"/>
-                <w:szCs w:val="24"/>
-              </w:rPr>
-              <w:t>-oracle ls -l /opt/oracle/product/26ai/</w:t>
-            </w:r>
-            <w:proofErr w:type="spellStart"/>
-            <w:r>
-              <w:rPr>
-                <w:rFonts w:ascii="Courier New" w:hAnsi="Courier New" w:cs="Courier New"/>
-                <w:sz w:val="24"/>
-                <w:szCs w:val="24"/>
-              </w:rPr>
-              <w:t>dbhomeFree</w:t>
-            </w:r>
-            <w:proofErr w:type="spellEnd"/>
-            <w:r>
-              <w:rPr>
-                <w:rFonts w:ascii="Courier New" w:hAnsi="Courier New" w:cs="Courier New"/>
-                <w:sz w:val="24"/>
-                <w:szCs w:val="24"/>
-              </w:rPr>
-              <w:t>/</w:t>
-            </w:r>
-            <w:proofErr w:type="spellStart"/>
-            <w:r>
-              <w:rPr>
-                <w:rFonts w:ascii="Courier New" w:hAnsi="Courier New" w:cs="Courier New"/>
-                <w:sz w:val="24"/>
-                <w:szCs w:val="24"/>
-              </w:rPr>
-              <w:t>dbs</w:t>
-            </w:r>
-            <w:proofErr w:type="spellEnd"/>
-            <w:r>
-              <w:rPr>
-                <w:rFonts w:ascii="Courier New" w:hAnsi="Courier New" w:cs="Courier New"/>
-                <w:sz w:val="24"/>
-                <w:szCs w:val="24"/>
-              </w:rPr>
-              <w:t>/</w:t>
-            </w:r>
-            <w:proofErr w:type="spellStart"/>
-            <w:r>
-              <w:rPr>
-                <w:rFonts w:ascii="Courier New" w:hAnsi="Courier New" w:cs="Courier New"/>
-                <w:sz w:val="24"/>
-                <w:szCs w:val="24"/>
-              </w:rPr>
-              <w:t>orapwFREE</w:t>
-            </w:r>
-            <w:proofErr w:type="spellEnd"/>
           </w:p>
         </w:tc>
       </w:tr>
@@ -19689,6 +17075,7 @@
       <w:r>
         <w:rPr>
           <w:rFonts w:cs="Times New Roman"/>
+          <w:noProof/>
           <w:lang w:val="ru-RU"/>
         </w:rPr>
         <w:drawing>
@@ -19840,14 +17227,12 @@
         </w:rPr>
         <w:t>/</w:t>
       </w:r>
-      <w:proofErr w:type="spellStart"/>
       <w:r>
         <w:rPr>
           <w:rStyle w:val="a6"/>
         </w:rPr>
         <w:t>dbs</w:t>
       </w:r>
-      <w:proofErr w:type="spellEnd"/>
       <w:r>
         <w:rPr>
           <w:rStyle w:val="a6"/>
@@ -19861,14 +17246,12 @@
         </w:rPr>
         <w:t xml:space="preserve"> и имеет стандартное имя </w:t>
       </w:r>
-      <w:proofErr w:type="spellStart"/>
       <w:r>
         <w:rPr>
           <w:rStyle w:val="a6"/>
         </w:rPr>
         <w:t>orapwFREE</w:t>
       </w:r>
-      <w:proofErr w:type="spellEnd"/>
       <w:r>
         <w:rPr>
           <w:lang w:val="ru-RU"/>
@@ -19934,14 +17317,12 @@
         </w:rPr>
         <w:t>/</w:t>
       </w:r>
-      <w:proofErr w:type="spellStart"/>
       <w:r>
         <w:rPr>
           <w:rStyle w:val="a6"/>
         </w:rPr>
         <w:t>dbhomeFree</w:t>
       </w:r>
-      <w:proofErr w:type="spellEnd"/>
       <w:r>
         <w:rPr>
           <w:rStyle w:val="a6"/>
@@ -19949,14 +17330,12 @@
         </w:rPr>
         <w:t>/</w:t>
       </w:r>
-      <w:proofErr w:type="spellStart"/>
       <w:r>
         <w:rPr>
           <w:rStyle w:val="a6"/>
         </w:rPr>
         <w:t>dbs</w:t>
       </w:r>
-      <w:proofErr w:type="spellEnd"/>
       <w:r>
         <w:rPr>
           <w:rStyle w:val="a6"/>
@@ -19964,14 +17343,12 @@
         </w:rPr>
         <w:t>/</w:t>
       </w:r>
-      <w:proofErr w:type="spellStart"/>
       <w:r>
         <w:rPr>
           <w:rStyle w:val="a6"/>
         </w:rPr>
         <w:t>orapwFREE</w:t>
       </w:r>
-      <w:proofErr w:type="spellEnd"/>
       <w:r>
         <w:rPr>
           <w:lang w:val="ru-RU"/>
@@ -20145,25 +17522,7 @@
                 <w:sz w:val="24"/>
                 <w:szCs w:val="24"/>
               </w:rPr>
-              <w:t xml:space="preserve">FROM </w:t>
-            </w:r>
-            <w:proofErr w:type="spellStart"/>
-            <w:r>
-              <w:rPr>
-                <w:rFonts w:ascii="Courier New" w:hAnsi="Courier New" w:cs="Courier New"/>
-                <w:sz w:val="24"/>
-                <w:szCs w:val="24"/>
-              </w:rPr>
-              <w:t>v$diag_info</w:t>
-            </w:r>
-            <w:proofErr w:type="spellEnd"/>
-            <w:r>
-              <w:rPr>
-                <w:rFonts w:ascii="Courier New" w:hAnsi="Courier New" w:cs="Courier New"/>
-                <w:sz w:val="24"/>
-                <w:szCs w:val="24"/>
-              </w:rPr>
-              <w:t>;</w:t>
+              <w:t>FROM v$diag_info;</w:t>
             </w:r>
           </w:p>
         </w:tc>
@@ -20292,6 +17651,7 @@
       <w:r>
         <w:rPr>
           <w:rFonts w:cs="Times New Roman"/>
+          <w:noProof/>
           <w:lang w:val="ru-RU"/>
         </w:rPr>
         <w:drawing>
@@ -20400,27 +17760,7 @@
           <w:szCs w:val="28"/>
           <w:lang w:val="ru-RU" w:eastAsia="ru-RU"/>
         </w:rPr>
-        <w:t xml:space="preserve">В результате выполнения SQL-запроса к системному представлению </w:t>
-      </w:r>
-      <w:proofErr w:type="spellStart"/>
-      <w:r>
-        <w:rPr>
-          <w:rFonts w:cs="Times New Roman"/>
-          <w:color w:val="auto"/>
-          <w:szCs w:val="28"/>
-          <w:lang w:val="ru-RU" w:eastAsia="ru-RU"/>
-        </w:rPr>
-        <w:t>v$diag_info</w:t>
-      </w:r>
-      <w:proofErr w:type="spellEnd"/>
-      <w:r>
-        <w:rPr>
-          <w:rFonts w:cs="Times New Roman"/>
-          <w:color w:val="auto"/>
-          <w:szCs w:val="28"/>
-          <w:lang w:val="ru-RU" w:eastAsia="ru-RU"/>
-        </w:rPr>
-        <w:t xml:space="preserve"> был успешно получен перечень путей к директориям, используемым для хранения файлов сообщений и диагностической информации инфраструктуры базы данных. Запрос вернул 13 записей, демонстрирующих физические пути к ключевым каталогам на сервере (включая ORACLE_HOME и расположение журналов).</w:t>
+        <w:t>В результате выполнения SQL-запроса к системному представлению v$diag_info был успешно получен перечень путей к директориям, используемым для хранения файлов сообщений и диагностической информации инфраструктуры базы данных. Запрос вернул 13 записей, демонстрирующих физические пути к ключевым каталогам на сервере (включая ORACLE_HOME и расположение журналов).</w:t>
       </w:r>
     </w:p>
     <w:p>
@@ -20592,79 +17932,7 @@
                 <w:sz w:val="24"/>
                 <w:szCs w:val="24"/>
               </w:rPr>
-              <w:t xml:space="preserve">docker exec -it </w:t>
-            </w:r>
-            <w:proofErr w:type="spellStart"/>
-            <w:r>
-              <w:rPr>
-                <w:rFonts w:ascii="Courier New" w:hAnsi="Courier New" w:cs="Courier New"/>
-                <w:sz w:val="24"/>
-                <w:szCs w:val="24"/>
-              </w:rPr>
-              <w:t>aar</w:t>
-            </w:r>
-            <w:proofErr w:type="spellEnd"/>
-            <w:r>
-              <w:rPr>
-                <w:rFonts w:ascii="Courier New" w:hAnsi="Courier New" w:cs="Courier New"/>
-                <w:sz w:val="24"/>
-                <w:szCs w:val="24"/>
-              </w:rPr>
-              <w:t>-oracle grep -</w:t>
-            </w:r>
-            <w:proofErr w:type="spellStart"/>
-            <w:r>
-              <w:rPr>
-                <w:rFonts w:ascii="Courier New" w:hAnsi="Courier New" w:cs="Courier New"/>
-                <w:sz w:val="24"/>
-                <w:szCs w:val="24"/>
-              </w:rPr>
-              <w:t>i</w:t>
-            </w:r>
-            <w:proofErr w:type="spellEnd"/>
-            <w:r>
-              <w:rPr>
-                <w:rFonts w:ascii="Courier New" w:hAnsi="Courier New" w:cs="Courier New"/>
-                <w:sz w:val="24"/>
-                <w:szCs w:val="24"/>
-              </w:rPr>
-              <w:t xml:space="preserve"> -C 2 "SWITCH LOGFILE" /opt/oracle/</w:t>
-            </w:r>
-            <w:proofErr w:type="spellStart"/>
-            <w:r>
-              <w:rPr>
-                <w:rFonts w:ascii="Courier New" w:hAnsi="Courier New" w:cs="Courier New"/>
-                <w:sz w:val="24"/>
-                <w:szCs w:val="24"/>
-              </w:rPr>
-              <w:t>diag</w:t>
-            </w:r>
-            <w:proofErr w:type="spellEnd"/>
-            <w:r>
-              <w:rPr>
-                <w:rFonts w:ascii="Courier New" w:hAnsi="Courier New" w:cs="Courier New"/>
-                <w:sz w:val="24"/>
-                <w:szCs w:val="24"/>
-              </w:rPr>
-              <w:t>/</w:t>
-            </w:r>
-            <w:proofErr w:type="spellStart"/>
-            <w:r>
-              <w:rPr>
-                <w:rFonts w:ascii="Courier New" w:hAnsi="Courier New" w:cs="Courier New"/>
-                <w:sz w:val="24"/>
-                <w:szCs w:val="24"/>
-              </w:rPr>
-              <w:t>rdbms</w:t>
-            </w:r>
-            <w:proofErr w:type="spellEnd"/>
-            <w:r>
-              <w:rPr>
-                <w:rFonts w:ascii="Courier New" w:hAnsi="Courier New" w:cs="Courier New"/>
-                <w:sz w:val="24"/>
-                <w:szCs w:val="24"/>
-              </w:rPr>
-              <w:t>/free/FREE/alert/log.xml</w:t>
+              <w:t>docker exec -it aar-oracle grep -i -C 2 "SWITCH LOGFILE" /opt/oracle/diag/rdbms/free/FREE/alert/log.xml</w:t>
             </w:r>
           </w:p>
         </w:tc>
@@ -20793,6 +18061,7 @@
       <w:r>
         <w:rPr>
           <w:rFonts w:cs="Times New Roman"/>
+          <w:noProof/>
           <w:lang w:val="ru-RU"/>
         </w:rPr>
         <w:drawing>
@@ -21092,27 +18361,7 @@
           <w:szCs w:val="28"/>
           <w:lang w:val="ru-RU" w:eastAsia="ru-RU"/>
         </w:rPr>
-        <w:t xml:space="preserve">В результате выполнения заданий были получены практические навыки работы со структурами хранения данных: созданы и удалены табличные пространства, сгенерированы массивы тестовых данных, а также изучено распределение памяти на уровне сегментов и экстентов. Успешно применена технология </w:t>
-      </w:r>
-      <w:proofErr w:type="spellStart"/>
-      <w:r>
-        <w:rPr>
-          <w:rFonts w:cs="Times New Roman"/>
-          <w:color w:val="auto"/>
-          <w:szCs w:val="28"/>
-          <w:lang w:val="ru-RU" w:eastAsia="ru-RU"/>
-        </w:rPr>
-        <w:t>Flashback</w:t>
-      </w:r>
-      <w:proofErr w:type="spellEnd"/>
-      <w:r>
-        <w:rPr>
-          <w:rFonts w:cs="Times New Roman"/>
-          <w:color w:val="auto"/>
-          <w:szCs w:val="28"/>
-          <w:lang w:val="ru-RU" w:eastAsia="ru-RU"/>
-        </w:rPr>
-        <w:t xml:space="preserve"> для восстановления удаленной таблицы из системной корзины.</w:t>
+        <w:t>В результате выполнения заданий были получены практические навыки работы со структурами хранения данных: созданы и удалены табличные пространства, сгенерированы массивы тестовых данных, а также изучено распределение памяти на уровне сегментов и экстентов. Успешно применена технология Flashback для восстановления удаленной таблицы из системной корзины.</w:t>
       </w:r>
     </w:p>
     <w:p>
@@ -21134,47 +18383,7 @@
           <w:szCs w:val="28"/>
           <w:lang w:val="ru-RU" w:eastAsia="ru-RU"/>
         </w:rPr>
-        <w:t>Особое внимание было уделено механизмам журналирования и отказоустойчивости. Были отработаны навыки управления группами журналов транзакций (</w:t>
-      </w:r>
-      <w:proofErr w:type="spellStart"/>
-      <w:r>
-        <w:rPr>
-          <w:rFonts w:cs="Times New Roman"/>
-          <w:color w:val="auto"/>
-          <w:szCs w:val="28"/>
-          <w:lang w:val="ru-RU" w:eastAsia="ru-RU"/>
-        </w:rPr>
-        <w:t>Redo</w:t>
-      </w:r>
-      <w:proofErr w:type="spellEnd"/>
-      <w:r>
-        <w:rPr>
-          <w:rFonts w:cs="Times New Roman"/>
-          <w:color w:val="auto"/>
-          <w:szCs w:val="28"/>
-          <w:lang w:val="ru-RU" w:eastAsia="ru-RU"/>
-        </w:rPr>
-        <w:t xml:space="preserve"> </w:t>
-      </w:r>
-      <w:proofErr w:type="spellStart"/>
-      <w:r>
-        <w:rPr>
-          <w:rFonts w:cs="Times New Roman"/>
-          <w:color w:val="auto"/>
-          <w:szCs w:val="28"/>
-          <w:lang w:val="ru-RU" w:eastAsia="ru-RU"/>
-        </w:rPr>
-        <w:t>Logs</w:t>
-      </w:r>
-      <w:proofErr w:type="spellEnd"/>
-      <w:r>
-        <w:rPr>
-          <w:rFonts w:cs="Times New Roman"/>
-          <w:color w:val="auto"/>
-          <w:szCs w:val="28"/>
-          <w:lang w:val="ru-RU" w:eastAsia="ru-RU"/>
-        </w:rPr>
-        <w:t>), выполнено ручное переключение файлов, а также успешно произведен перевод базы данных в режим архивирования (ARCHIVELOG) через запуск экземпляра в состоянии MOUNT и последующий возврат в режим NOARCHIVELOG.</w:t>
+        <w:t>Особое внимание было уделено механизмам журналирования и отказоустойчивости. Были отработаны навыки управления группами журналов транзакций (Redo Logs), выполнено ручное переключение файлов, а также успешно произведен перевод базы данных в режим архивирования (ARCHIVELOG) через запуск экземпляра в состоянии MOUNT и последующий возврат в режим NOARCHIVELOG.</w:t>
       </w:r>
     </w:p>
     <w:p>

</xml_diff>